<commit_message>
Publish output/en/resume.docx (run 20260817T091259Z-manual)
</commit_message>
<xml_diff>
--- a/output/en/resume.docx
+++ b/output/en/resume.docx
@@ -1033,178 +1033,6 @@
                 <w:color w:val="111111"/>
                 <w:sz w:val="21"/>
               </w:rPr>
-              <w:t>AI News Agent — Three-Scenario Routing Chatbot</w:t>
-            </w:r>
-          </w:p>
-        </w:tc>
-        <w:tc>
-          <w:tcPr>
-            <w:tcW w:type="dxa" w:w="5159"/>
-          </w:tcPr>
-          <w:p>
-            <w:pPr>
-              <w:spacing w:before="0" w:after="0"/>
-              <w:jc w:val="right"/>
-            </w:pPr>
-            <w:r>
-              <w:rPr>
-                <w:rFonts w:ascii="Noto Sans" w:hAnsi="Noto Sans"/>
-                <w:b w:val="0"/>
-                <w:i w:val="0"/>
-                <w:color w:val="444444"/>
-                <w:sz w:val="19"/>
-              </w:rPr>
-              <w:t>Cathay Financial Holdings, DDT AI</w:t>
-            </w:r>
-          </w:p>
-        </w:tc>
-      </w:tr>
-    </w:tbl>
-    <w:p>
-      <w:pPr>
-        <w:spacing w:before="20" w:after="0"/>
-        <w:ind w:left="193" w:hanging="193"/>
-      </w:pPr>
-      <w:r>
-        <w:rPr>
-          <w:rFonts w:ascii="Noto Sans" w:hAnsi="Noto Sans"/>
-          <w:b w:val="0"/>
-          <w:i w:val="0"/>
-          <w:color w:val="111111"/>
-          <w:sz w:val="16"/>
-        </w:rPr>
-        <w:t xml:space="preserve">▪ </w:t>
-      </w:r>
-      <w:r>
-        <w:rPr>
-          <w:rFonts w:ascii="Noto Sans" w:hAnsi="Noto Sans"/>
-          <w:b w:val="0"/>
-          <w:i w:val="0"/>
-          <w:color w:val="111111"/>
-          <w:sz w:val="19"/>
-        </w:rPr>
-        <w:t>Built an internal AI research report query assistant using a four-layer architecture (Interface / Application / Data / External Services).</w:t>
-      </w:r>
-    </w:p>
-    <w:p>
-      <w:pPr>
-        <w:spacing w:before="40" w:after="0"/>
-        <w:ind w:left="193" w:hanging="193"/>
-      </w:pPr>
-      <w:r>
-        <w:rPr>
-          <w:rFonts w:ascii="Noto Sans" w:hAnsi="Noto Sans"/>
-          <w:b w:val="0"/>
-          <w:i w:val="0"/>
-          <w:color w:val="111111"/>
-          <w:sz w:val="16"/>
-        </w:rPr>
-        <w:t xml:space="preserve">▪ </w:t>
-      </w:r>
-      <w:r>
-        <w:rPr>
-          <w:rFonts w:ascii="Noto Sans" w:hAnsi="Noto Sans"/>
-          <w:b w:val="0"/>
-          <w:i w:val="0"/>
-          <w:color w:val="111111"/>
-          <w:sz w:val="19"/>
-        </w:rPr>
-        <w:t>Designed a three-scenario classification system (LLM intent detection + Python state machine) for intelligent routing across explicit, fuzzy, and out-of-scope queries.</w:t>
-      </w:r>
-    </w:p>
-    <w:p>
-      <w:pPr>
-        <w:spacing w:before="40" w:after="0"/>
-        <w:ind w:left="193" w:hanging="193"/>
-      </w:pPr>
-      <w:r>
-        <w:rPr>
-          <w:rFonts w:ascii="Noto Sans" w:hAnsi="Noto Sans"/>
-          <w:b w:val="0"/>
-          <w:i w:val="0"/>
-          <w:color w:val="111111"/>
-          <w:sz w:val="16"/>
-        </w:rPr>
-        <w:t xml:space="preserve">▪ </w:t>
-      </w:r>
-      <w:r>
-        <w:rPr>
-          <w:rFonts w:ascii="Noto Sans" w:hAnsi="Noto Sans"/>
-          <w:b w:val="0"/>
-          <w:i w:val="0"/>
-          <w:color w:val="111111"/>
-          <w:sz w:val="19"/>
-        </w:rPr>
-        <w:t>Implemented asynchronous Lambda self-invocation to overcome LINE Webhook's 1-second timeout, supporting 5–15 second LLM inference + RAG retrieval pipelines.</w:t>
-      </w:r>
-    </w:p>
-    <w:p>
-      <w:pPr>
-        <w:spacing w:before="40" w:after="0"/>
-        <w:ind w:left="193" w:hanging="193"/>
-      </w:pPr>
-      <w:r>
-        <w:rPr>
-          <w:rFonts w:ascii="Noto Sans" w:hAnsi="Noto Sans"/>
-          <w:b w:val="0"/>
-          <w:i w:val="0"/>
-          <w:color w:val="111111"/>
-          <w:sz w:val="16"/>
-        </w:rPr>
-        <w:t xml:space="preserve">▪ </w:t>
-      </w:r>
-      <w:r>
-        <w:rPr>
-          <w:rFonts w:ascii="Noto Sans" w:hAnsi="Noto Sans"/>
-          <w:b w:val="0"/>
-          <w:i w:val="0"/>
-          <w:color w:val="111111"/>
-          <w:sz w:val="19"/>
-        </w:rPr>
-        <w:t>Built a full ETL pipeline (Google Sheets → Bedrock Embedding → OpenSearch) with multi-dimensional filtering by topic, source, date, and subscription tier.</w:t>
-      </w:r>
-    </w:p>
-    <w:p>
-      <w:pPr>
-        <w:spacing w:after="140"/>
-      </w:pPr>
-    </w:p>
-    <w:tbl>
-      <w:tblPr>
-        <w:tblW w:type="auto" w:w="0"/>
-        <w:jc w:val="left"/>
-        <w:tblLayout w:type="autofit"/>
-        <w:tblLook w:firstColumn="1" w:firstRow="1" w:lastColumn="0" w:lastRow="0" w:noHBand="0" w:noVBand="1" w:val="04A0"/>
-        <w:tblBorders>
-          <w:top w:val="none" w:sz="0"/>
-          <w:left w:val="none" w:sz="0"/>
-          <w:bottom w:val="none" w:sz="0"/>
-          <w:right w:val="none" w:sz="0"/>
-          <w:insideH w:val="none" w:sz="0"/>
-          <w:insideV w:val="none" w:sz="0"/>
-        </w:tblBorders>
-      </w:tblPr>
-      <w:tblGrid>
-        <w:gridCol w:w="5159"/>
-        <w:gridCol w:w="5159"/>
-      </w:tblGrid>
-      <w:tr>
-        <w:tc>
-          <w:tcPr>
-            <w:tcW w:type="dxa" w:w="5159"/>
-          </w:tcPr>
-          <w:p>
-            <w:pPr>
-              <w:spacing w:before="0" w:after="0"/>
-            </w:pPr>
-            <w:r>
-              <w:rPr>
-                <w:rFonts w:ascii="Noto Sans" w:hAnsi="Noto Sans"/>
-                <w:b/>
-                <w:i w:val="0"/>
-                <w:color w:val="111111"/>
-                <w:sz w:val="21"/>
-              </w:rPr>
               <w:t>LLM Reasoning Research — Self-Discover-NLI</w:t>
             </w:r>
           </w:p>
@@ -1484,6 +1312,594 @@
     </w:p>
     <w:p>
       <w:pPr>
+        <w:spacing w:after="140"/>
+      </w:pPr>
+    </w:p>
+    <w:tbl>
+      <w:tblPr>
+        <w:tblW w:type="auto" w:w="0"/>
+        <w:jc w:val="left"/>
+        <w:tblLayout w:type="autofit"/>
+        <w:tblLook w:firstColumn="1" w:firstRow="1" w:lastColumn="0" w:lastRow="0" w:noHBand="0" w:noVBand="1" w:val="04A0"/>
+        <w:tblBorders>
+          <w:top w:val="none" w:sz="0"/>
+          <w:left w:val="none" w:sz="0"/>
+          <w:bottom w:val="none" w:sz="0"/>
+          <w:right w:val="none" w:sz="0"/>
+          <w:insideH w:val="none" w:sz="0"/>
+          <w:insideV w:val="none" w:sz="0"/>
+        </w:tblBorders>
+      </w:tblPr>
+      <w:tblGrid>
+        <w:gridCol w:w="5159"/>
+        <w:gridCol w:w="5159"/>
+      </w:tblGrid>
+      <w:tr>
+        <w:tc>
+          <w:tcPr>
+            <w:tcW w:type="dxa" w:w="5159"/>
+          </w:tcPr>
+          <w:p>
+            <w:pPr>
+              <w:spacing w:before="0" w:after="0"/>
+            </w:pPr>
+            <w:r>
+              <w:rPr>
+                <w:rFonts w:ascii="Noto Sans" w:hAnsi="Noto Sans"/>
+                <w:b/>
+                <w:i w:val="0"/>
+                <w:color w:val="111111"/>
+                <w:sz w:val="21"/>
+              </w:rPr>
+              <w:t>voice-notion — Slack 語音轉 Notion 機器人雲原生架構</w:t>
+            </w:r>
+          </w:p>
+        </w:tc>
+        <w:tc>
+          <w:tcPr>
+            <w:tcW w:type="dxa" w:w="5159"/>
+          </w:tcPr>
+          <w:p>
+            <w:pPr>
+              <w:spacing w:before="0" w:after="0"/>
+              <w:jc w:val="right"/>
+            </w:pPr>
+            <w:r>
+              <w:rPr>
+                <w:rFonts w:ascii="Noto Sans" w:hAnsi="Noto Sans"/>
+                <w:b w:val="0"/>
+                <w:i w:val="0"/>
+                <w:color w:val="444444"/>
+                <w:sz w:val="19"/>
+              </w:rPr>
+              <w:t>AWS (ap-northeast-1 + us-east-1)</w:t>
+            </w:r>
+          </w:p>
+        </w:tc>
+      </w:tr>
+    </w:tbl>
+    <w:p>
+      <w:pPr>
+        <w:spacing w:before="20" w:after="0"/>
+        <w:ind w:left="193" w:hanging="193"/>
+      </w:pPr>
+      <w:r>
+        <w:rPr>
+          <w:rFonts w:ascii="Noto Sans" w:hAnsi="Noto Sans"/>
+          <w:b w:val="0"/>
+          <w:i w:val="0"/>
+          <w:color w:val="111111"/>
+          <w:sz w:val="16"/>
+        </w:rPr>
+        <w:t xml:space="preserve">▪ </w:t>
+      </w:r>
+      <w:r>
+        <w:rPr>
+          <w:rFonts w:ascii="Noto Sans" w:hAnsi="Noto Sans"/>
+          <w:b w:val="0"/>
+          <w:i w:val="0"/>
+          <w:color w:val="111111"/>
+          <w:sz w:val="19"/>
+        </w:rPr>
+        <w:t>Re-architected a single-instance Next.js service into a cloud-native ECS Fargate deployment with DynamoDB, SQS and EventBridge to enable horizontal scaling and zero-data-loss rolling updates</w:t>
+      </w:r>
+    </w:p>
+    <w:p>
+      <w:pPr>
+        <w:spacing w:before="40" w:after="0"/>
+        <w:ind w:left="193" w:hanging="193"/>
+      </w:pPr>
+      <w:r>
+        <w:rPr>
+          <w:rFonts w:ascii="Noto Sans" w:hAnsi="Noto Sans"/>
+          <w:b w:val="0"/>
+          <w:i w:val="0"/>
+          <w:color w:val="111111"/>
+          <w:sz w:val="16"/>
+        </w:rPr>
+        <w:t xml:space="preserve">▪ </w:t>
+      </w:r>
+      <w:r>
+        <w:rPr>
+          <w:rFonts w:ascii="Noto Sans" w:hAnsi="Noto Sans"/>
+          <w:b w:val="0"/>
+          <w:i w:val="0"/>
+          <w:color w:val="111111"/>
+          <w:sz w:val="19"/>
+        </w:rPr>
+        <w:t>Built a Slack bot that converts voice or text @mentions into confirmable Notion pages and tasks, plus a daily automated standup summary</w:t>
+      </w:r>
+    </w:p>
+    <w:p>
+      <w:pPr>
+        <w:spacing w:before="40" w:after="0"/>
+        <w:ind w:left="193" w:hanging="193"/>
+      </w:pPr>
+      <w:r>
+        <w:rPr>
+          <w:rFonts w:ascii="Noto Sans" w:hAnsi="Noto Sans"/>
+          <w:b w:val="0"/>
+          <w:i w:val="0"/>
+          <w:color w:val="111111"/>
+          <w:sz w:val="16"/>
+        </w:rPr>
+        <w:t xml:space="preserve">▪ </w:t>
+      </w:r>
+      <w:r>
+        <w:rPr>
+          <w:rFonts w:ascii="Noto Sans" w:hAnsi="Noto Sans"/>
+          <w:b w:val="0"/>
+          <w:i w:val="0"/>
+          <w:color w:val="111111"/>
+          <w:sz w:val="19"/>
+        </w:rPr>
+        <w:t>Ran web and worker containers from one image in a single Fargate task, differentiating roles only by start command (node server.js / node dist/worker.js)</w:t>
+      </w:r>
+    </w:p>
+    <w:p>
+      <w:pPr>
+        <w:spacing w:before="40" w:after="0"/>
+        <w:ind w:left="193" w:hanging="193"/>
+      </w:pPr>
+      <w:r>
+        <w:rPr>
+          <w:rFonts w:ascii="Noto Sans" w:hAnsi="Noto Sans"/>
+          <w:b w:val="0"/>
+          <w:i w:val="0"/>
+          <w:color w:val="111111"/>
+          <w:sz w:val="16"/>
+        </w:rPr>
+        <w:t xml:space="preserve">▪ </w:t>
+      </w:r>
+      <w:r>
+        <w:rPr>
+          <w:rFonts w:ascii="Noto Sans" w:hAnsi="Noto Sans"/>
+          <w:b w:val="0"/>
+          <w:i w:val="0"/>
+          <w:color w:val="111111"/>
+          <w:sz w:val="19"/>
+        </w:rPr>
+        <w:t>Split webhook handling so web verified signatures, enqueued to SQS and returned 200 within 3s while worker handled 30–120s transcription and LLM work</w:t>
+      </w:r>
+    </w:p>
+    <w:p>
+      <w:pPr>
+        <w:spacing w:before="40" w:after="0"/>
+        <w:ind w:left="193" w:hanging="193"/>
+      </w:pPr>
+      <w:r>
+        <w:rPr>
+          <w:rFonts w:ascii="Noto Sans" w:hAnsi="Noto Sans"/>
+          <w:b w:val="0"/>
+          <w:i w:val="0"/>
+          <w:color w:val="111111"/>
+          <w:sz w:val="16"/>
+        </w:rPr>
+        <w:t xml:space="preserve">▪ </w:t>
+      </w:r>
+      <w:r>
+        <w:rPr>
+          <w:rFonts w:ascii="Noto Sans" w:hAnsi="Noto Sans"/>
+          <w:b w:val="0"/>
+          <w:i w:val="0"/>
+          <w:color w:val="111111"/>
+          <w:sz w:val="19"/>
+        </w:rPr>
+        <w:t>Replaced 6 in-memory state stores with a DynamoDB single-table design (PK/SK, TTL) so state survived task restarts and was shared across containers</w:t>
+      </w:r>
+    </w:p>
+    <w:p>
+      <w:pPr>
+        <w:spacing w:before="40" w:after="0"/>
+        <w:ind w:left="193" w:hanging="193"/>
+      </w:pPr>
+      <w:r>
+        <w:rPr>
+          <w:rFonts w:ascii="Noto Sans" w:hAnsi="Noto Sans"/>
+          <w:b w:val="0"/>
+          <w:i w:val="0"/>
+          <w:color w:val="111111"/>
+          <w:sz w:val="16"/>
+        </w:rPr>
+        <w:t xml:space="preserve">▪ </w:t>
+      </w:r>
+      <w:r>
+        <w:rPr>
+          <w:rFonts w:ascii="Noto Sans" w:hAnsi="Noto Sans"/>
+          <w:b w:val="0"/>
+          <w:i w:val="0"/>
+          <w:color w:val="111111"/>
+          <w:sz w:val="19"/>
+        </w:rPr>
+        <w:t>Added atomic operations using UpdateItem with ConditionExpression (claimDraft) and PutItem with attribute_not_exists to prevent duplicate submissions across containers</w:t>
+      </w:r>
+    </w:p>
+    <w:p>
+      <w:pPr>
+        <w:spacing w:before="40" w:after="0"/>
+        <w:ind w:left="193" w:hanging="193"/>
+      </w:pPr>
+      <w:r>
+        <w:rPr>
+          <w:rFonts w:ascii="Noto Sans" w:hAnsi="Noto Sans"/>
+          <w:b w:val="0"/>
+          <w:i w:val="0"/>
+          <w:color w:val="111111"/>
+          <w:sz w:val="16"/>
+        </w:rPr>
+        <w:t xml:space="preserve">▪ </w:t>
+      </w:r>
+      <w:r>
+        <w:rPr>
+          <w:rFonts w:ascii="Noto Sans" w:hAnsi="Noto Sans"/>
+          <w:b w:val="0"/>
+          <w:i w:val="0"/>
+          <w:color w:val="111111"/>
+          <w:sz w:val="19"/>
+        </w:rPr>
+        <w:t>Configured SQS main queue plus DLQ with VisibilityTimeout=180 and maxReceiveCount=3 to persist, retry and isolate poison messages</w:t>
+      </w:r>
+    </w:p>
+    <w:p>
+      <w:pPr>
+        <w:spacing w:before="40" w:after="0"/>
+        <w:ind w:left="193" w:hanging="193"/>
+      </w:pPr>
+      <w:r>
+        <w:rPr>
+          <w:rFonts w:ascii="Noto Sans" w:hAnsi="Noto Sans"/>
+          <w:b w:val="0"/>
+          <w:i w:val="0"/>
+          <w:color w:val="111111"/>
+          <w:sz w:val="16"/>
+        </w:rPr>
+        <w:t xml:space="preserve">▪ </w:t>
+      </w:r>
+      <w:r>
+        <w:rPr>
+          <w:rFonts w:ascii="Noto Sans" w:hAnsi="Noto Sans"/>
+          <w:b w:val="0"/>
+          <w:i w:val="0"/>
+          <w:color w:val="111111"/>
+          <w:sz w:val="19"/>
+        </w:rPr>
+        <w:t>Built a speech-to-text pipeline using ffmpeg (16k mono 16-bit LPCM, 3200B/100ms chunks) into Amazon Transcribe streaming with multi-language zh-TW+en-US identification</w:t>
+      </w:r>
+    </w:p>
+    <w:p>
+      <w:pPr>
+        <w:spacing w:before="40" w:after="0"/>
+        <w:ind w:left="193" w:hanging="193"/>
+      </w:pPr>
+      <w:r>
+        <w:rPr>
+          <w:rFonts w:ascii="Noto Sans" w:hAnsi="Noto Sans"/>
+          <w:b w:val="0"/>
+          <w:i w:val="0"/>
+          <w:color w:val="111111"/>
+          <w:sz w:val="16"/>
+        </w:rPr>
+        <w:t xml:space="preserve">▪ </w:t>
+      </w:r>
+      <w:r>
+        <w:rPr>
+          <w:rFonts w:ascii="Noto Sans" w:hAnsi="Noto Sans"/>
+          <w:b w:val="0"/>
+          <w:i w:val="0"/>
+          <w:color w:val="111111"/>
+          <w:sz w:val="19"/>
+        </w:rPr>
+        <w:t>Created custom Transcribe vocabularies (voice-notion-zhtw / voice-notion-enus) synced from lib/vocabulary.ts and MEMBERS_JSON to improve recognition of member names and project terms</w:t>
+      </w:r>
+    </w:p>
+    <w:p>
+      <w:pPr>
+        <w:spacing w:before="40" w:after="0"/>
+        <w:ind w:left="193" w:hanging="193"/>
+      </w:pPr>
+      <w:r>
+        <w:rPr>
+          <w:rFonts w:ascii="Noto Sans" w:hAnsi="Noto Sans"/>
+          <w:b w:val="0"/>
+          <w:i w:val="0"/>
+          <w:color w:val="111111"/>
+          <w:sz w:val="16"/>
+        </w:rPr>
+        <w:t xml:space="preserve">▪ </w:t>
+      </w:r>
+      <w:r>
+        <w:rPr>
+          <w:rFonts w:ascii="Noto Sans" w:hAnsi="Noto Sans"/>
+          <w:b w:val="0"/>
+          <w:i w:val="0"/>
+          <w:color w:val="111111"/>
+          <w:sz w:val="19"/>
+        </w:rPr>
+        <w:t>Integrated Bedrock Claude Opus 4.8 via the AnthropicBedrockMantle client in us-east-1 using ECS task role SigV4 auth with no API key</w:t>
+      </w:r>
+    </w:p>
+    <w:p>
+      <w:pPr>
+        <w:spacing w:before="40" w:after="0"/>
+        <w:ind w:left="193" w:hanging="193"/>
+      </w:pPr>
+      <w:r>
+        <w:rPr>
+          <w:rFonts w:ascii="Noto Sans" w:hAnsi="Noto Sans"/>
+          <w:b w:val="0"/>
+          <w:i w:val="0"/>
+          <w:color w:val="111111"/>
+          <w:sz w:val="16"/>
+        </w:rPr>
+        <w:t xml:space="preserve">▪ </w:t>
+      </w:r>
+      <w:r>
+        <w:rPr>
+          <w:rFonts w:ascii="Noto Sans" w:hAnsi="Noto Sans"/>
+          <w:b w:val="0"/>
+          <w:i w:val="0"/>
+          <w:color w:val="111111"/>
+          <w:sz w:val="19"/>
+        </w:rPr>
+        <w:t>Migrated speech recognition from Bedrock Nova 2 Sonic to Amazon Transcribe after Sonic returned transcriptLength:0 across three attempts, as it is a speech-to-speech model</w:t>
+      </w:r>
+    </w:p>
+    <w:p>
+      <w:pPr>
+        <w:spacing w:before="40" w:after="0"/>
+        <w:ind w:left="193" w:hanging="193"/>
+      </w:pPr>
+      <w:r>
+        <w:rPr>
+          <w:rFonts w:ascii="Noto Sans" w:hAnsi="Noto Sans"/>
+          <w:b w:val="0"/>
+          <w:i w:val="0"/>
+          <w:color w:val="111111"/>
+          <w:sz w:val="16"/>
+        </w:rPr>
+        <w:t xml:space="preserve">▪ </w:t>
+      </w:r>
+      <w:r>
+        <w:rPr>
+          <w:rFonts w:ascii="Noto Sans" w:hAnsi="Noto Sans"/>
+          <w:b w:val="0"/>
+          <w:i w:val="0"/>
+          <w:color w:val="111111"/>
+          <w:sz w:val="19"/>
+        </w:rPr>
+        <w:t>Fixed a standup retry storm by changing the cron route to enqueue + immediate 200 and setting EventBridge target MaximumRetryAttempts=0, eliminating duplicate summaries</w:t>
+      </w:r>
+    </w:p>
+    <w:p>
+      <w:pPr>
+        <w:spacing w:before="40" w:after="0"/>
+        <w:ind w:left="193" w:hanging="193"/>
+      </w:pPr>
+      <w:r>
+        <w:rPr>
+          <w:rFonts w:ascii="Noto Sans" w:hAnsi="Noto Sans"/>
+          <w:b w:val="0"/>
+          <w:i w:val="0"/>
+          <w:color w:val="111111"/>
+          <w:sz w:val="16"/>
+        </w:rPr>
+        <w:t xml:space="preserve">▪ </w:t>
+      </w:r>
+      <w:r>
+        <w:rPr>
+          <w:rFonts w:ascii="Noto Sans" w:hAnsi="Noto Sans"/>
+          <w:b w:val="0"/>
+          <w:i w:val="0"/>
+          <w:color w:val="111111"/>
+          <w:sz w:val="19"/>
+        </w:rPr>
+        <w:t>Reworked deployment for compliance (Security Hub ECS.2/ECS.5) by moving tasks to dual-AZ private subnets with assignPublicIp=DISABLED, NAT egress, readonly root filesystem and ephemeral volumes</w:t>
+      </w:r>
+    </w:p>
+    <w:p>
+      <w:pPr>
+        <w:spacing w:before="40" w:after="0"/>
+        <w:ind w:left="193" w:hanging="193"/>
+      </w:pPr>
+      <w:r>
+        <w:rPr>
+          <w:rFonts w:ascii="Noto Sans" w:hAnsi="Noto Sans"/>
+          <w:b w:val="0"/>
+          <w:i w:val="0"/>
+          <w:color w:val="111111"/>
+          <w:sz w:val="16"/>
+        </w:rPr>
+        <w:t xml:space="preserve">▪ </w:t>
+      </w:r>
+      <w:r>
+        <w:rPr>
+          <w:rFonts w:ascii="Noto Sans" w:hAnsi="Noto Sans"/>
+          <w:b w:val="0"/>
+          <w:i w:val="0"/>
+          <w:color w:val="111111"/>
+          <w:sz w:val="19"/>
+        </w:rPr>
+        <w:t>Reused the existing aaron-dev ALB by adding a Target Group and a host-based rule (priority 20) on the 443 listener instead of provisioning new ALB/ACM/Route53</w:t>
+      </w:r>
+    </w:p>
+    <w:p>
+      <w:pPr>
+        <w:spacing w:before="40" w:after="0"/>
+        <w:ind w:left="193" w:hanging="193"/>
+      </w:pPr>
+      <w:r>
+        <w:rPr>
+          <w:rFonts w:ascii="Noto Sans" w:hAnsi="Noto Sans"/>
+          <w:b w:val="0"/>
+          <w:i w:val="0"/>
+          <w:color w:val="111111"/>
+          <w:sz w:val="16"/>
+        </w:rPr>
+        <w:t xml:space="preserve">▪ </w:t>
+      </w:r>
+      <w:r>
+        <w:rPr>
+          <w:rFonts w:ascii="Noto Sans" w:hAnsi="Noto Sans"/>
+          <w:b w:val="0"/>
+          <w:i w:val="0"/>
+          <w:color w:val="111111"/>
+          <w:sz w:val="19"/>
+        </w:rPr>
+        <w:t>Stored Notion / Slack tokens, CRON_SECRET and MEMBERS_JSON as SSM Parameter Store SecureString values injected into the task at startup</w:t>
+      </w:r>
+    </w:p>
+    <w:p>
+      <w:pPr>
+        <w:spacing w:before="40" w:after="0"/>
+        <w:ind w:left="193" w:hanging="193"/>
+      </w:pPr>
+      <w:r>
+        <w:rPr>
+          <w:rFonts w:ascii="Noto Sans" w:hAnsi="Noto Sans"/>
+          <w:b w:val="0"/>
+          <w:i w:val="0"/>
+          <w:color w:val="111111"/>
+          <w:sz w:val="16"/>
+        </w:rPr>
+        <w:t xml:space="preserve">▪ </w:t>
+      </w:r>
+      <w:r>
+        <w:rPr>
+          <w:rFonts w:ascii="Noto Sans" w:hAnsi="Noto Sans"/>
+          <w:b w:val="0"/>
+          <w:i w:val="0"/>
+          <w:color w:val="111111"/>
+          <w:sz w:val="19"/>
+        </w:rPr>
+        <w:t>Split IAM into execution and task roles, scoping the task role to DynamoDB/SQS, bedrock:InvokeModel, bedrock-mantle:* and transcribe:StartStreamTranscription</w:t>
+      </w:r>
+    </w:p>
+    <w:p>
+      <w:pPr>
+        <w:spacing w:before="40" w:after="0"/>
+        <w:ind w:left="193" w:hanging="193"/>
+      </w:pPr>
+      <w:r>
+        <w:rPr>
+          <w:rFonts w:ascii="Noto Sans" w:hAnsi="Noto Sans"/>
+          <w:b w:val="0"/>
+          <w:i w:val="0"/>
+          <w:color w:val="111111"/>
+          <w:sz w:val="16"/>
+        </w:rPr>
+        <w:t xml:space="preserve">▪ </w:t>
+      </w:r>
+      <w:r>
+        <w:rPr>
+          <w:rFonts w:ascii="Noto Sans" w:hAnsi="Noto Sans"/>
+          <w:b w:val="0"/>
+          <w:i w:val="0"/>
+          <w:color w:val="111111"/>
+          <w:sz w:val="19"/>
+        </w:rPr>
+        <w:t>Evaluated Lambda + API Gateway, self-managed EC2 and App Runner against ECS Fargate on persistent worker, cold start/ffmpeg, HA, ops cost and private-subnet criteria</w:t>
+      </w:r>
+    </w:p>
+    <w:p>
+      <w:pPr>
+        <w:spacing w:before="40" w:after="0"/>
+        <w:ind w:left="193" w:hanging="193"/>
+      </w:pPr>
+      <w:r>
+        <w:rPr>
+          <w:rFonts w:ascii="Noto Sans" w:hAnsi="Noto Sans"/>
+          <w:b w:val="0"/>
+          <w:i w:val="0"/>
+          <w:color w:val="111111"/>
+          <w:sz w:val="16"/>
+        </w:rPr>
+        <w:t xml:space="preserve">▪ </w:t>
+      </w:r>
+      <w:r>
+        <w:rPr>
+          <w:rFonts w:ascii="Noto Sans" w:hAnsi="Noto Sans"/>
+          <w:b w:val="0"/>
+          <w:i w:val="0"/>
+          <w:color w:val="111111"/>
+          <w:sz w:val="19"/>
+        </w:rPr>
+        <w:t>Documented cost estimate of ~$57/month excluding AI usage by reusing the existing ALB and NAT, with a documented lever to switch to claude-sonnet-4-6 via environment variable</w:t>
+      </w:r>
+    </w:p>
+    <w:p>
+      <w:pPr>
+        <w:spacing w:before="40" w:after="0"/>
+        <w:ind w:left="193" w:hanging="193"/>
+      </w:pPr>
+      <w:r>
+        <w:rPr>
+          <w:rFonts w:ascii="Noto Sans" w:hAnsi="Noto Sans"/>
+          <w:b w:val="0"/>
+          <w:i w:val="0"/>
+          <w:color w:val="111111"/>
+          <w:sz w:val="16"/>
+        </w:rPr>
+        <w:t xml:space="preserve">▪ </w:t>
+      </w:r>
+      <w:r>
+        <w:rPr>
+          <w:rFonts w:ascii="Noto Sans" w:hAnsi="Noto Sans"/>
+          <w:b w:val="0"/>
+          <w:i w:val="0"/>
+          <w:color w:val="111111"/>
+          <w:sz w:val="19"/>
+        </w:rPr>
+        <w:t>Wrote an operations runbook covering releases, rollback by task-def revision, log tailing, DLQ redrive, secret rotation and scaling</w:t>
+      </w:r>
+    </w:p>
+    <w:p>
+      <w:pPr>
+        <w:spacing w:before="40" w:after="0"/>
+        <w:ind w:left="193" w:hanging="193"/>
+      </w:pPr>
+      <w:r>
+        <w:rPr>
+          <w:rFonts w:ascii="Noto Sans" w:hAnsi="Noto Sans"/>
+          <w:b w:val="0"/>
+          <w:i w:val="0"/>
+          <w:color w:val="111111"/>
+          <w:sz w:val="16"/>
+        </w:rPr>
+        <w:t xml:space="preserve">▪ </w:t>
+      </w:r>
+      <w:r>
+        <w:rPr>
+          <w:rFonts w:ascii="Noto Sans" w:hAnsi="Noto Sans"/>
+          <w:b w:val="0"/>
+          <w:i w:val="0"/>
+          <w:color w:val="111111"/>
+          <w:sz w:val="19"/>
+        </w:rPr>
+        <w:t>Iterated the task definition from rev1 to rev9, each revision tied to a specific failure such as Mantle 404, unsupported output_config, Security Hub findings and duplicate standup triggers</w:t>
+      </w:r>
+    </w:p>
+    <w:p>
+      <w:pPr>
         <w:spacing w:before="240" w:after="60"/>
         <w:keepNext/>
         <w:pBdr>
@@ -1572,7 +1988,7 @@
           <w:color w:val="111111"/>
           <w:sz w:val="19"/>
         </w:rPr>
-        <w:t>AWS (Lambda, Bedrock, OpenSearch)</w:t>
+        <w:t>AWS (Lambda, Bedrock, OpenSearch), Amazon Bedrock (Claude Opus 4.8 via AnthropicBedrockMantle client), Amazon DynamoDB (single-table design, on-demand, TTL), Amazon ECR (image storage tagged by git SHA / timestamp), Amazon EventBridge (classic Rule, cron + API destination with Bearer auth), Amazon SQS (main queue + DLQ, long-poll consumer)</w:t>
       </w:r>
     </w:p>
     <w:p>
@@ -1622,7 +2038,7 @@
           <w:color w:val="111111"/>
           <w:sz w:val="19"/>
         </w:rPr>
-        <w:t>Microsoft Office</w:t>
+        <w:t>Microsoft Office, AWS CLI (register-task-definition, create-service, update-service, logs tail), Docker (node:20-slim image with ffmpeg, --no-cache builds)</w:t>
       </w:r>
     </w:p>
     <w:p>

</xml_diff>

<commit_message>
Publish output/en/resume.docx (run 20260817T092455Z-manual)
</commit_message>
<xml_diff>
--- a/output/en/resume.docx
+++ b/output/en/resume.docx
@@ -1372,7 +1372,7 @@
                 <w:color w:val="444444"/>
                 <w:sz w:val="19"/>
               </w:rPr>
-              <w:t>AWS (ap-northeast-1 + us-east-1)</w:t>
+              <w:t>Cathay Financial Holdings, DDT AI</w:t>
             </w:r>
           </w:p>
         </w:tc>
@@ -1381,32 +1381,6 @@
     <w:p>
       <w:pPr>
         <w:spacing w:before="20" w:after="0"/>
-        <w:ind w:left="193" w:hanging="193"/>
-      </w:pPr>
-      <w:r>
-        <w:rPr>
-          <w:rFonts w:ascii="Noto Sans" w:hAnsi="Noto Sans"/>
-          <w:b w:val="0"/>
-          <w:i w:val="0"/>
-          <w:color w:val="111111"/>
-          <w:sz w:val="16"/>
-        </w:rPr>
-        <w:t xml:space="preserve">▪ </w:t>
-      </w:r>
-      <w:r>
-        <w:rPr>
-          <w:rFonts w:ascii="Noto Sans" w:hAnsi="Noto Sans"/>
-          <w:b w:val="0"/>
-          <w:i w:val="0"/>
-          <w:color w:val="111111"/>
-          <w:sz w:val="19"/>
-        </w:rPr>
-        <w:t>Re-architected a single-instance Next.js service into a cloud-native ECS Fargate deployment with DynamoDB, SQS and EventBridge to enable horizontal scaling and zero-data-loss rolling updates</w:t>
-      </w:r>
-    </w:p>
-    <w:p>
-      <w:pPr>
-        <w:spacing w:before="40" w:after="0"/>
         <w:ind w:left="193" w:hanging="193"/>
       </w:pPr>
       <w:r>
@@ -1453,7 +1427,7 @@
           <w:color w:val="111111"/>
           <w:sz w:val="19"/>
         </w:rPr>
-        <w:t>Ran web and worker containers from one image in a single Fargate task, differentiating roles only by start command (node server.js / node dist/worker.js)</w:t>
+        <w:t>Re-architected a single-instance Next.js service into a cloud-native ECS Fargate deployment with DynamoDB, SQS and EventBridge to enable horizontal scaling and zero-data-loss rolling updates</w:t>
       </w:r>
     </w:p>
     <w:p>
@@ -1505,397 +1479,7 @@
           <w:color w:val="111111"/>
           <w:sz w:val="19"/>
         </w:rPr>
-        <w:t>Replaced 6 in-memory state stores with a DynamoDB single-table design (PK/SK, TTL) so state survived task restarts and was shared across containers</w:t>
-      </w:r>
-    </w:p>
-    <w:p>
-      <w:pPr>
-        <w:spacing w:before="40" w:after="0"/>
-        <w:ind w:left="193" w:hanging="193"/>
-      </w:pPr>
-      <w:r>
-        <w:rPr>
-          <w:rFonts w:ascii="Noto Sans" w:hAnsi="Noto Sans"/>
-          <w:b w:val="0"/>
-          <w:i w:val="0"/>
-          <w:color w:val="111111"/>
-          <w:sz w:val="16"/>
-        </w:rPr>
-        <w:t xml:space="preserve">▪ </w:t>
-      </w:r>
-      <w:r>
-        <w:rPr>
-          <w:rFonts w:ascii="Noto Sans" w:hAnsi="Noto Sans"/>
-          <w:b w:val="0"/>
-          <w:i w:val="0"/>
-          <w:color w:val="111111"/>
-          <w:sz w:val="19"/>
-        </w:rPr>
-        <w:t>Added atomic operations using UpdateItem with ConditionExpression (claimDraft) and PutItem with attribute_not_exists to prevent duplicate submissions across containers</w:t>
-      </w:r>
-    </w:p>
-    <w:p>
-      <w:pPr>
-        <w:spacing w:before="40" w:after="0"/>
-        <w:ind w:left="193" w:hanging="193"/>
-      </w:pPr>
-      <w:r>
-        <w:rPr>
-          <w:rFonts w:ascii="Noto Sans" w:hAnsi="Noto Sans"/>
-          <w:b w:val="0"/>
-          <w:i w:val="0"/>
-          <w:color w:val="111111"/>
-          <w:sz w:val="16"/>
-        </w:rPr>
-        <w:t xml:space="preserve">▪ </w:t>
-      </w:r>
-      <w:r>
-        <w:rPr>
-          <w:rFonts w:ascii="Noto Sans" w:hAnsi="Noto Sans"/>
-          <w:b w:val="0"/>
-          <w:i w:val="0"/>
-          <w:color w:val="111111"/>
-          <w:sz w:val="19"/>
-        </w:rPr>
-        <w:t>Configured SQS main queue plus DLQ with VisibilityTimeout=180 and maxReceiveCount=3 to persist, retry and isolate poison messages</w:t>
-      </w:r>
-    </w:p>
-    <w:p>
-      <w:pPr>
-        <w:spacing w:before="40" w:after="0"/>
-        <w:ind w:left="193" w:hanging="193"/>
-      </w:pPr>
-      <w:r>
-        <w:rPr>
-          <w:rFonts w:ascii="Noto Sans" w:hAnsi="Noto Sans"/>
-          <w:b w:val="0"/>
-          <w:i w:val="0"/>
-          <w:color w:val="111111"/>
-          <w:sz w:val="16"/>
-        </w:rPr>
-        <w:t xml:space="preserve">▪ </w:t>
-      </w:r>
-      <w:r>
-        <w:rPr>
-          <w:rFonts w:ascii="Noto Sans" w:hAnsi="Noto Sans"/>
-          <w:b w:val="0"/>
-          <w:i w:val="0"/>
-          <w:color w:val="111111"/>
-          <w:sz w:val="19"/>
-        </w:rPr>
-        <w:t>Built a speech-to-text pipeline using ffmpeg (16k mono 16-bit LPCM, 3200B/100ms chunks) into Amazon Transcribe streaming with multi-language zh-TW+en-US identification</w:t>
-      </w:r>
-    </w:p>
-    <w:p>
-      <w:pPr>
-        <w:spacing w:before="40" w:after="0"/>
-        <w:ind w:left="193" w:hanging="193"/>
-      </w:pPr>
-      <w:r>
-        <w:rPr>
-          <w:rFonts w:ascii="Noto Sans" w:hAnsi="Noto Sans"/>
-          <w:b w:val="0"/>
-          <w:i w:val="0"/>
-          <w:color w:val="111111"/>
-          <w:sz w:val="16"/>
-        </w:rPr>
-        <w:t xml:space="preserve">▪ </w:t>
-      </w:r>
-      <w:r>
-        <w:rPr>
-          <w:rFonts w:ascii="Noto Sans" w:hAnsi="Noto Sans"/>
-          <w:b w:val="0"/>
-          <w:i w:val="0"/>
-          <w:color w:val="111111"/>
-          <w:sz w:val="19"/>
-        </w:rPr>
-        <w:t>Created custom Transcribe vocabularies (voice-notion-zhtw / voice-notion-enus) synced from lib/vocabulary.ts and MEMBERS_JSON to improve recognition of member names and project terms</w:t>
-      </w:r>
-    </w:p>
-    <w:p>
-      <w:pPr>
-        <w:spacing w:before="40" w:after="0"/>
-        <w:ind w:left="193" w:hanging="193"/>
-      </w:pPr>
-      <w:r>
-        <w:rPr>
-          <w:rFonts w:ascii="Noto Sans" w:hAnsi="Noto Sans"/>
-          <w:b w:val="0"/>
-          <w:i w:val="0"/>
-          <w:color w:val="111111"/>
-          <w:sz w:val="16"/>
-        </w:rPr>
-        <w:t xml:space="preserve">▪ </w:t>
-      </w:r>
-      <w:r>
-        <w:rPr>
-          <w:rFonts w:ascii="Noto Sans" w:hAnsi="Noto Sans"/>
-          <w:b w:val="0"/>
-          <w:i w:val="0"/>
-          <w:color w:val="111111"/>
-          <w:sz w:val="19"/>
-        </w:rPr>
-        <w:t>Integrated Bedrock Claude Opus 4.8 via the AnthropicBedrockMantle client in us-east-1 using ECS task role SigV4 auth with no API key</w:t>
-      </w:r>
-    </w:p>
-    <w:p>
-      <w:pPr>
-        <w:spacing w:before="40" w:after="0"/>
-        <w:ind w:left="193" w:hanging="193"/>
-      </w:pPr>
-      <w:r>
-        <w:rPr>
-          <w:rFonts w:ascii="Noto Sans" w:hAnsi="Noto Sans"/>
-          <w:b w:val="0"/>
-          <w:i w:val="0"/>
-          <w:color w:val="111111"/>
-          <w:sz w:val="16"/>
-        </w:rPr>
-        <w:t xml:space="preserve">▪ </w:t>
-      </w:r>
-      <w:r>
-        <w:rPr>
-          <w:rFonts w:ascii="Noto Sans" w:hAnsi="Noto Sans"/>
-          <w:b w:val="0"/>
-          <w:i w:val="0"/>
-          <w:color w:val="111111"/>
-          <w:sz w:val="19"/>
-        </w:rPr>
-        <w:t>Migrated speech recognition from Bedrock Nova 2 Sonic to Amazon Transcribe after Sonic returned transcriptLength:0 across three attempts, as it is a speech-to-speech model</w:t>
-      </w:r>
-    </w:p>
-    <w:p>
-      <w:pPr>
-        <w:spacing w:before="40" w:after="0"/>
-        <w:ind w:left="193" w:hanging="193"/>
-      </w:pPr>
-      <w:r>
-        <w:rPr>
-          <w:rFonts w:ascii="Noto Sans" w:hAnsi="Noto Sans"/>
-          <w:b w:val="0"/>
-          <w:i w:val="0"/>
-          <w:color w:val="111111"/>
-          <w:sz w:val="16"/>
-        </w:rPr>
-        <w:t xml:space="preserve">▪ </w:t>
-      </w:r>
-      <w:r>
-        <w:rPr>
-          <w:rFonts w:ascii="Noto Sans" w:hAnsi="Noto Sans"/>
-          <w:b w:val="0"/>
-          <w:i w:val="0"/>
-          <w:color w:val="111111"/>
-          <w:sz w:val="19"/>
-        </w:rPr>
-        <w:t>Fixed a standup retry storm by changing the cron route to enqueue + immediate 200 and setting EventBridge target MaximumRetryAttempts=0, eliminating duplicate summaries</w:t>
-      </w:r>
-    </w:p>
-    <w:p>
-      <w:pPr>
-        <w:spacing w:before="40" w:after="0"/>
-        <w:ind w:left="193" w:hanging="193"/>
-      </w:pPr>
-      <w:r>
-        <w:rPr>
-          <w:rFonts w:ascii="Noto Sans" w:hAnsi="Noto Sans"/>
-          <w:b w:val="0"/>
-          <w:i w:val="0"/>
-          <w:color w:val="111111"/>
-          <w:sz w:val="16"/>
-        </w:rPr>
-        <w:t xml:space="preserve">▪ </w:t>
-      </w:r>
-      <w:r>
-        <w:rPr>
-          <w:rFonts w:ascii="Noto Sans" w:hAnsi="Noto Sans"/>
-          <w:b w:val="0"/>
-          <w:i w:val="0"/>
-          <w:color w:val="111111"/>
-          <w:sz w:val="19"/>
-        </w:rPr>
-        <w:t>Reworked deployment for compliance (Security Hub ECS.2/ECS.5) by moving tasks to dual-AZ private subnets with assignPublicIp=DISABLED, NAT egress, readonly root filesystem and ephemeral volumes</w:t>
-      </w:r>
-    </w:p>
-    <w:p>
-      <w:pPr>
-        <w:spacing w:before="40" w:after="0"/>
-        <w:ind w:left="193" w:hanging="193"/>
-      </w:pPr>
-      <w:r>
-        <w:rPr>
-          <w:rFonts w:ascii="Noto Sans" w:hAnsi="Noto Sans"/>
-          <w:b w:val="0"/>
-          <w:i w:val="0"/>
-          <w:color w:val="111111"/>
-          <w:sz w:val="16"/>
-        </w:rPr>
-        <w:t xml:space="preserve">▪ </w:t>
-      </w:r>
-      <w:r>
-        <w:rPr>
-          <w:rFonts w:ascii="Noto Sans" w:hAnsi="Noto Sans"/>
-          <w:b w:val="0"/>
-          <w:i w:val="0"/>
-          <w:color w:val="111111"/>
-          <w:sz w:val="19"/>
-        </w:rPr>
-        <w:t>Reused the existing aaron-dev ALB by adding a Target Group and a host-based rule (priority 20) on the 443 listener instead of provisioning new ALB/ACM/Route53</w:t>
-      </w:r>
-    </w:p>
-    <w:p>
-      <w:pPr>
-        <w:spacing w:before="40" w:after="0"/>
-        <w:ind w:left="193" w:hanging="193"/>
-      </w:pPr>
-      <w:r>
-        <w:rPr>
-          <w:rFonts w:ascii="Noto Sans" w:hAnsi="Noto Sans"/>
-          <w:b w:val="0"/>
-          <w:i w:val="0"/>
-          <w:color w:val="111111"/>
-          <w:sz w:val="16"/>
-        </w:rPr>
-        <w:t xml:space="preserve">▪ </w:t>
-      </w:r>
-      <w:r>
-        <w:rPr>
-          <w:rFonts w:ascii="Noto Sans" w:hAnsi="Noto Sans"/>
-          <w:b w:val="0"/>
-          <w:i w:val="0"/>
-          <w:color w:val="111111"/>
-          <w:sz w:val="19"/>
-        </w:rPr>
-        <w:t>Stored Notion / Slack tokens, CRON_SECRET and MEMBERS_JSON as SSM Parameter Store SecureString values injected into the task at startup</w:t>
-      </w:r>
-    </w:p>
-    <w:p>
-      <w:pPr>
-        <w:spacing w:before="40" w:after="0"/>
-        <w:ind w:left="193" w:hanging="193"/>
-      </w:pPr>
-      <w:r>
-        <w:rPr>
-          <w:rFonts w:ascii="Noto Sans" w:hAnsi="Noto Sans"/>
-          <w:b w:val="0"/>
-          <w:i w:val="0"/>
-          <w:color w:val="111111"/>
-          <w:sz w:val="16"/>
-        </w:rPr>
-        <w:t xml:space="preserve">▪ </w:t>
-      </w:r>
-      <w:r>
-        <w:rPr>
-          <w:rFonts w:ascii="Noto Sans" w:hAnsi="Noto Sans"/>
-          <w:b w:val="0"/>
-          <w:i w:val="0"/>
-          <w:color w:val="111111"/>
-          <w:sz w:val="19"/>
-        </w:rPr>
-        <w:t>Split IAM into execution and task roles, scoping the task role to DynamoDB/SQS, bedrock:InvokeModel, bedrock-mantle:* and transcribe:StartStreamTranscription</w:t>
-      </w:r>
-    </w:p>
-    <w:p>
-      <w:pPr>
-        <w:spacing w:before="40" w:after="0"/>
-        <w:ind w:left="193" w:hanging="193"/>
-      </w:pPr>
-      <w:r>
-        <w:rPr>
-          <w:rFonts w:ascii="Noto Sans" w:hAnsi="Noto Sans"/>
-          <w:b w:val="0"/>
-          <w:i w:val="0"/>
-          <w:color w:val="111111"/>
-          <w:sz w:val="16"/>
-        </w:rPr>
-        <w:t xml:space="preserve">▪ </w:t>
-      </w:r>
-      <w:r>
-        <w:rPr>
-          <w:rFonts w:ascii="Noto Sans" w:hAnsi="Noto Sans"/>
-          <w:b w:val="0"/>
-          <w:i w:val="0"/>
-          <w:color w:val="111111"/>
-          <w:sz w:val="19"/>
-        </w:rPr>
         <w:t>Evaluated Lambda + API Gateway, self-managed EC2 and App Runner against ECS Fargate on persistent worker, cold start/ffmpeg, HA, ops cost and private-subnet criteria</w:t>
-      </w:r>
-    </w:p>
-    <w:p>
-      <w:pPr>
-        <w:spacing w:before="40" w:after="0"/>
-        <w:ind w:left="193" w:hanging="193"/>
-      </w:pPr>
-      <w:r>
-        <w:rPr>
-          <w:rFonts w:ascii="Noto Sans" w:hAnsi="Noto Sans"/>
-          <w:b w:val="0"/>
-          <w:i w:val="0"/>
-          <w:color w:val="111111"/>
-          <w:sz w:val="16"/>
-        </w:rPr>
-        <w:t xml:space="preserve">▪ </w:t>
-      </w:r>
-      <w:r>
-        <w:rPr>
-          <w:rFonts w:ascii="Noto Sans" w:hAnsi="Noto Sans"/>
-          <w:b w:val="0"/>
-          <w:i w:val="0"/>
-          <w:color w:val="111111"/>
-          <w:sz w:val="19"/>
-        </w:rPr>
-        <w:t>Documented cost estimate of ~$57/month excluding AI usage by reusing the existing ALB and NAT, with a documented lever to switch to claude-sonnet-4-6 via environment variable</w:t>
-      </w:r>
-    </w:p>
-    <w:p>
-      <w:pPr>
-        <w:spacing w:before="40" w:after="0"/>
-        <w:ind w:left="193" w:hanging="193"/>
-      </w:pPr>
-      <w:r>
-        <w:rPr>
-          <w:rFonts w:ascii="Noto Sans" w:hAnsi="Noto Sans"/>
-          <w:b w:val="0"/>
-          <w:i w:val="0"/>
-          <w:color w:val="111111"/>
-          <w:sz w:val="16"/>
-        </w:rPr>
-        <w:t xml:space="preserve">▪ </w:t>
-      </w:r>
-      <w:r>
-        <w:rPr>
-          <w:rFonts w:ascii="Noto Sans" w:hAnsi="Noto Sans"/>
-          <w:b w:val="0"/>
-          <w:i w:val="0"/>
-          <w:color w:val="111111"/>
-          <w:sz w:val="19"/>
-        </w:rPr>
-        <w:t>Wrote an operations runbook covering releases, rollback by task-def revision, log tailing, DLQ redrive, secret rotation and scaling</w:t>
-      </w:r>
-    </w:p>
-    <w:p>
-      <w:pPr>
-        <w:spacing w:before="40" w:after="0"/>
-        <w:ind w:left="193" w:hanging="193"/>
-      </w:pPr>
-      <w:r>
-        <w:rPr>
-          <w:rFonts w:ascii="Noto Sans" w:hAnsi="Noto Sans"/>
-          <w:b w:val="0"/>
-          <w:i w:val="0"/>
-          <w:color w:val="111111"/>
-          <w:sz w:val="16"/>
-        </w:rPr>
-        <w:t xml:space="preserve">▪ </w:t>
-      </w:r>
-      <w:r>
-        <w:rPr>
-          <w:rFonts w:ascii="Noto Sans" w:hAnsi="Noto Sans"/>
-          <w:b w:val="0"/>
-          <w:i w:val="0"/>
-          <w:color w:val="111111"/>
-          <w:sz w:val="19"/>
-        </w:rPr>
-        <w:t>Iterated the task definition from rev1 to rev9, each revision tied to a specific failure such as Mantle 404, unsupported output_config, Security Hub findings and duplicate standup triggers</w:t>
       </w:r>
     </w:p>
     <w:p>

</xml_diff>

<commit_message>
Publish output/en/resume.docx (run 20260817T093722Z-manual)
</commit_message>
<xml_diff>
--- a/output/en/resume.docx
+++ b/output/en/resume.docx
@@ -1351,7 +1351,7 @@
                 <w:color w:val="111111"/>
                 <w:sz w:val="21"/>
               </w:rPr>
-              <w:t>voice-notion — Slack 語音轉 Notion 機器人雲原生架構</w:t>
+              <w:t>Voice-Notion — Cloud-First Standup Assistant</w:t>
             </w:r>
           </w:p>
         </w:tc>
@@ -1401,7 +1401,7 @@
           <w:color w:val="111111"/>
           <w:sz w:val="19"/>
         </w:rPr>
-        <w:t>Built a Slack bot that converts voice or text @mentions into confirmable Notion pages and tasks, plus a daily automated standup summary</w:t>
+        <w:t>Built a Slack bot that converts mp4 work oral report into confirmable Notion pages and tasks, plus a daily automated standup summary</w:t>
       </w:r>
     </w:p>
     <w:p>

</xml_diff>

<commit_message>
Publish output/en/resume.docx (run 20260817T094341Z-manual)
</commit_message>
<xml_diff>
--- a/output/en/resume.docx
+++ b/output/en/resume.docx
@@ -1281,33 +1281,7 @@
           <w:color w:val="111111"/>
           <w:sz w:val="19"/>
         </w:rPr>
-        <w:t>Consult mode: Step 1 auto-drafts the BRD outline from per-BU YAML templates, tagging sections auto_filled / needs_round2 / placeholder; Step 2 interviews only needs_round2 with live-preview inline edit, keeping BU interview time to 20–30 min.</w:t>
-      </w:r>
-    </w:p>
-    <w:p>
-      <w:pPr>
-        <w:spacing w:before="40" w:after="0"/>
-        <w:ind w:left="193" w:hanging="193"/>
-      </w:pPr>
-      <w:r>
-        <w:rPr>
-          <w:rFonts w:ascii="Noto Sans" w:hAnsi="Noto Sans"/>
-          <w:b w:val="0"/>
-          <w:i w:val="0"/>
-          <w:color w:val="111111"/>
-          <w:sz w:val="16"/>
-        </w:rPr>
-        <w:t xml:space="preserve">▪ </w:t>
-      </w:r>
-      <w:r>
-        <w:rPr>
-          <w:rFonts w:ascii="Noto Sans" w:hAnsi="Noto Sans"/>
-          <w:b w:val="0"/>
-          <w:i w:val="0"/>
-          <w:color w:val="111111"/>
-          <w:sz w:val="19"/>
-        </w:rPr>
-        <w:t>Outputs v1.0 BRD + summary.json + full conversation_trace + flag_for_ba_review list; handoff notifies the BA Agent for review.</w:t>
+        <w:t>Consult mode: Step 1 auto-drafts the BRD outline from per-BU YAML templates and adding status tags for each sections; Step 2 interviews only “needs_round2” tag with live-preview inline edit, keeping BU interview time to 20–30 min.</w:t>
       </w:r>
     </w:p>
     <w:p>

</xml_diff>

<commit_message>
Publish output/en/resume.docx (run 20260828T062613Z-manual)
</commit_message>
<xml_diff>
--- a/output/en/resume.docx
+++ b/output/en/resume.docx
@@ -1033,7 +1033,7 @@
                 <w:color w:val="111111"/>
                 <w:sz w:val="21"/>
               </w:rPr>
-              <w:t>LLM Reasoning Research — Self-Discover-NLI</w:t>
+              <w:t>AI News Agent — Three-Scenario Routing Chatbot</w:t>
             </w:r>
           </w:p>
         </w:tc>
@@ -1054,7 +1054,7 @@
                 <w:color w:val="444444"/>
                 <w:sz w:val="19"/>
               </w:rPr>
-              <w:t>ROCLING Conference 2025</w:t>
+              <w:t>Cathay Financial Holdings, DDT AI</w:t>
             </w:r>
           </w:p>
         </w:tc>
@@ -1083,7 +1083,7 @@
           <w:color w:val="111111"/>
           <w:sz w:val="19"/>
         </w:rPr>
-        <w:t>Developed and presented the "Self-Discover-NLI" prompt engineering framework, adapting the three-step Self-Discover pipeline (SELECT → ADAPT → APPLY) specifically for Natural Language Inference (NLI) tasks.</w:t>
+        <w:t>Built an internal AI research report query assistant using a four-layer architecture (Interface / Application / Data / External Services).</w:t>
       </w:r>
     </w:p>
     <w:p>
@@ -1109,7 +1109,7 @@
           <w:color w:val="111111"/>
           <w:sz w:val="19"/>
         </w:rPr>
-        <w:t>Conducted systematic experiments on the IMPPRES dataset (95 tasks per trigger type), evaluating GPT-4o's handling of clefts, conditionals, modals, and other linguistic triggers.</w:t>
+        <w:t>Designed a three-scenario classification system (LLM intent detection + Python state machine) for intelligent routing across explicit, fuzzy, and out-of-scope queries.</w:t>
       </w:r>
     </w:p>
     <w:p>
@@ -1135,7 +1135,33 @@
           <w:color w:val="111111"/>
           <w:sz w:val="19"/>
         </w:rPr>
-        <w:t>Achieved ~10% overall accuracy improvement; performed in-depth error analysis identifying systematic model weaknesses.</w:t>
+        <w:t>Implemented asynchronous Lambda self-invocation to overcome LINE Webhook's 1-second timeout, supporting 5–15 second LLM inference + RAG retrieval pipelines.</w:t>
+      </w:r>
+    </w:p>
+    <w:p>
+      <w:pPr>
+        <w:spacing w:before="40" w:after="0"/>
+        <w:ind w:left="193" w:hanging="193"/>
+      </w:pPr>
+      <w:r>
+        <w:rPr>
+          <w:rFonts w:ascii="Noto Sans" w:hAnsi="Noto Sans"/>
+          <w:b w:val="0"/>
+          <w:i w:val="0"/>
+          <w:color w:val="111111"/>
+          <w:sz w:val="16"/>
+        </w:rPr>
+        <w:t xml:space="preserve">▪ </w:t>
+      </w:r>
+      <w:r>
+        <w:rPr>
+          <w:rFonts w:ascii="Noto Sans" w:hAnsi="Noto Sans"/>
+          <w:b w:val="0"/>
+          <w:i w:val="0"/>
+          <w:color w:val="111111"/>
+          <w:sz w:val="19"/>
+        </w:rPr>
+        <w:t>Built a full ETL pipeline (Google Sheets → Bedrock Embedding → OpenSearch) with multi-dimensional filtering by topic, source, date, and subscription tier.</w:t>
       </w:r>
     </w:p>
     <w:p>
@@ -1471,6 +1497,165 @@
           <w:color w:val="111111"/>
           <w:sz w:val="21"/>
         </w:rPr>
+        <w:t>PUBLICATIONS &amp; TALKS</w:t>
+      </w:r>
+    </w:p>
+    <w:tbl>
+      <w:tblPr>
+        <w:tblW w:type="auto" w:w="0"/>
+        <w:jc w:val="left"/>
+        <w:tblLayout w:type="autofit"/>
+        <w:tblLook w:firstColumn="1" w:firstRow="1" w:lastColumn="0" w:lastRow="0" w:noHBand="0" w:noVBand="1" w:val="04A0"/>
+        <w:tblBorders>
+          <w:top w:val="none" w:sz="0"/>
+          <w:left w:val="none" w:sz="0"/>
+          <w:bottom w:val="none" w:sz="0"/>
+          <w:right w:val="none" w:sz="0"/>
+          <w:insideH w:val="none" w:sz="0"/>
+          <w:insideV w:val="none" w:sz="0"/>
+        </w:tblBorders>
+      </w:tblPr>
+      <w:tblGrid>
+        <w:gridCol w:w="5159"/>
+        <w:gridCol w:w="5159"/>
+      </w:tblGrid>
+      <w:tr>
+        <w:tc>
+          <w:tcPr>
+            <w:tcW w:type="dxa" w:w="5159"/>
+          </w:tcPr>
+          <w:p>
+            <w:pPr>
+              <w:spacing w:before="0" w:after="0"/>
+            </w:pPr>
+            <w:r>
+              <w:rPr>
+                <w:rFonts w:ascii="Noto Sans" w:hAnsi="Noto Sans"/>
+                <w:b/>
+                <w:i w:val="0"/>
+                <w:color w:val="111111"/>
+                <w:sz w:val="21"/>
+              </w:rPr>
+              <w:t>Examining LLM's Ability to Judge Presuppositions: A Comparative Study of Zero-Shot and Self-Discover-NLI Prompting</w:t>
+            </w:r>
+          </w:p>
+        </w:tc>
+        <w:tc>
+          <w:tcPr>
+            <w:tcW w:type="dxa" w:w="5159"/>
+          </w:tcPr>
+          <w:p>
+            <w:pPr>
+              <w:spacing w:before="0" w:after="0"/>
+              <w:jc w:val="right"/>
+            </w:pPr>
+            <w:r>
+              <w:rPr>
+                <w:rFonts w:ascii="Noto Sans" w:hAnsi="Noto Sans"/>
+                <w:b w:val="0"/>
+                <w:i w:val="0"/>
+                <w:color w:val="444444"/>
+                <w:sz w:val="19"/>
+              </w:rPr>
+              <w:t>Oct 2025</w:t>
+            </w:r>
+          </w:p>
+        </w:tc>
+      </w:tr>
+    </w:tbl>
+    <w:p>
+      <w:pPr>
+        <w:spacing w:before="20" w:after="0"/>
+        <w:ind w:left="193" w:hanging="193"/>
+      </w:pPr>
+      <w:r>
+        <w:rPr>
+          <w:rFonts w:ascii="Noto Sans" w:hAnsi="Noto Sans"/>
+          <w:b w:val="0"/>
+          <w:i w:val="0"/>
+          <w:color w:val="111111"/>
+          <w:sz w:val="16"/>
+        </w:rPr>
+        <w:t xml:space="preserve">▪ </w:t>
+      </w:r>
+      <w:r>
+        <w:rPr>
+          <w:rFonts w:ascii="Noto Sans" w:hAnsi="Noto Sans"/>
+          <w:b w:val="0"/>
+          <w:i w:val="0"/>
+          <w:color w:val="111111"/>
+          <w:sz w:val="19"/>
+        </w:rPr>
+        <w:t>Developed and presented the "Self-Discover-NLI" prompt engineering framework, adapting the three-step Self-Discover pipeline (SELECT → ADAPT → APPLY) specifically for Natural Language Inference (NLI) tasks.</w:t>
+      </w:r>
+    </w:p>
+    <w:p>
+      <w:pPr>
+        <w:spacing w:before="40" w:after="0"/>
+        <w:ind w:left="193" w:hanging="193"/>
+      </w:pPr>
+      <w:r>
+        <w:rPr>
+          <w:rFonts w:ascii="Noto Sans" w:hAnsi="Noto Sans"/>
+          <w:b w:val="0"/>
+          <w:i w:val="0"/>
+          <w:color w:val="111111"/>
+          <w:sz w:val="16"/>
+        </w:rPr>
+        <w:t xml:space="preserve">▪ </w:t>
+      </w:r>
+      <w:r>
+        <w:rPr>
+          <w:rFonts w:ascii="Noto Sans" w:hAnsi="Noto Sans"/>
+          <w:b w:val="0"/>
+          <w:i w:val="0"/>
+          <w:color w:val="111111"/>
+          <w:sz w:val="19"/>
+        </w:rPr>
+        <w:t>Conducted systematic experiments on the IMPPRES dataset (95 tasks per trigger type), evaluating GPT-4o's handling of clefts, conditionals, modals, and other linguistic triggers.</w:t>
+      </w:r>
+    </w:p>
+    <w:p>
+      <w:pPr>
+        <w:spacing w:before="40" w:after="0"/>
+        <w:ind w:left="193" w:hanging="193"/>
+      </w:pPr>
+      <w:r>
+        <w:rPr>
+          <w:rFonts w:ascii="Noto Sans" w:hAnsi="Noto Sans"/>
+          <w:b w:val="0"/>
+          <w:i w:val="0"/>
+          <w:color w:val="111111"/>
+          <w:sz w:val="16"/>
+        </w:rPr>
+        <w:t xml:space="preserve">▪ </w:t>
+      </w:r>
+      <w:r>
+        <w:rPr>
+          <w:rFonts w:ascii="Noto Sans" w:hAnsi="Noto Sans"/>
+          <w:b w:val="0"/>
+          <w:i w:val="0"/>
+          <w:color w:val="111111"/>
+          <w:sz w:val="19"/>
+        </w:rPr>
+        <w:t>Achieved ~10% overall accuracy improvement; performed in-depth error analysis identifying systematic model weaknesses.</w:t>
+      </w:r>
+    </w:p>
+    <w:p>
+      <w:pPr>
+        <w:spacing w:before="240" w:after="60"/>
+        <w:keepNext/>
+        <w:pBdr>
+          <w:bottom w:val="single" w:sz="4" w:space="2" w:color="111111"/>
+        </w:pBdr>
+      </w:pPr>
+      <w:r>
+        <w:rPr>
+          <w:rFonts w:ascii="Noto Serif" w:hAnsi="Noto Serif"/>
+          <w:b/>
+          <w:color w:val="111111"/>
+          <w:sz w:val="21"/>
+        </w:rPr>
         <w:t>SKILLS</w:t>
       </w:r>
     </w:p>
@@ -1546,7 +1731,7 @@
           <w:color w:val="111111"/>
           <w:sz w:val="19"/>
         </w:rPr>
-        <w:t>AWS (Lambda, Bedrock, OpenSearch), Amazon Bedrock (Claude Opus 4.8 via AnthropicBedrockMantle client), Amazon DynamoDB (single-table design, on-demand, TTL), Amazon ECR (image storage tagged by git SHA / timestamp), Amazon EventBridge (classic Rule, cron + API destination with Bearer auth), Amazon SQS (main queue + DLQ, long-poll consumer)</w:t>
+        <w:t>AWS (Lambda, Bedrock, OpenSearch, DynamoDB, Amazon ECR, EventBridge, Amazon SQS)</w:t>
       </w:r>
     </w:p>
     <w:p>
@@ -1571,7 +1756,7 @@
           <w:color w:val="111111"/>
           <w:sz w:val="19"/>
         </w:rPr>
-        <w:t>LangGraph</w:t>
+        <w:t>LangGraph, LangChain</w:t>
       </w:r>
     </w:p>
     <w:p>
@@ -1621,7 +1806,7 @@
           <w:color w:val="111111"/>
           <w:sz w:val="19"/>
         </w:rPr>
-        <w:t>TOEIC (Listening and Reading 985, Speaking 180, Writing 170)</w:t>
+        <w:t>TOEIC (Listening and Reading 985, Speaking 180, Writing 170), AWS SAA (Solutions Architect Associate)</w:t>
       </w:r>
     </w:p>
     <w:sectPr>

</xml_diff>

<commit_message>
Publish output/en/resume.docx (run 20260828T070902Z-manual)
</commit_message>
<xml_diff>
--- a/output/en/resume.docx
+++ b/output/en/resume.docx
@@ -1033,6 +1033,152 @@
                 <w:color w:val="111111"/>
                 <w:sz w:val="21"/>
               </w:rPr>
+              <w:t>Voice-Notion — Cloud-First Standup Assistant</w:t>
+            </w:r>
+          </w:p>
+        </w:tc>
+        <w:tc>
+          <w:tcPr>
+            <w:tcW w:type="dxa" w:w="5159"/>
+          </w:tcPr>
+          <w:p>
+            <w:pPr>
+              <w:spacing w:before="0" w:after="0"/>
+              <w:jc w:val="right"/>
+            </w:pPr>
+            <w:r>
+              <w:rPr>
+                <w:rFonts w:ascii="Noto Sans" w:hAnsi="Noto Sans"/>
+                <w:b w:val="0"/>
+                <w:i w:val="0"/>
+                <w:color w:val="444444"/>
+                <w:sz w:val="19"/>
+              </w:rPr>
+              <w:t>Cathay Financial Holdings, DDT AI</w:t>
+            </w:r>
+          </w:p>
+        </w:tc>
+      </w:tr>
+    </w:tbl>
+    <w:p>
+      <w:pPr>
+        <w:spacing w:before="20" w:after="0"/>
+        <w:ind w:left="193" w:hanging="193"/>
+      </w:pPr>
+      <w:r>
+        <w:rPr>
+          <w:rFonts w:ascii="Noto Sans" w:hAnsi="Noto Sans"/>
+          <w:b w:val="0"/>
+          <w:i w:val="0"/>
+          <w:color w:val="111111"/>
+          <w:sz w:val="16"/>
+        </w:rPr>
+        <w:t xml:space="preserve">▪ </w:t>
+      </w:r>
+      <w:r>
+        <w:rPr>
+          <w:rFonts w:ascii="Noto Sans" w:hAnsi="Noto Sans"/>
+          <w:b w:val="0"/>
+          <w:i w:val="0"/>
+          <w:color w:val="111111"/>
+          <w:sz w:val="19"/>
+        </w:rPr>
+        <w:t>Built a Slack bot that converts mp4 oral work report into confirmable Notion pages and tasks, plus a daily automated standup summary</w:t>
+      </w:r>
+    </w:p>
+    <w:p>
+      <w:pPr>
+        <w:spacing w:before="40" w:after="0"/>
+        <w:ind w:left="193" w:hanging="193"/>
+      </w:pPr>
+      <w:r>
+        <w:rPr>
+          <w:rFonts w:ascii="Noto Sans" w:hAnsi="Noto Sans"/>
+          <w:b w:val="0"/>
+          <w:i w:val="0"/>
+          <w:color w:val="111111"/>
+          <w:sz w:val="16"/>
+        </w:rPr>
+        <w:t xml:space="preserve">▪ </w:t>
+      </w:r>
+      <w:r>
+        <w:rPr>
+          <w:rFonts w:ascii="Noto Sans" w:hAnsi="Noto Sans"/>
+          <w:b w:val="0"/>
+          <w:i w:val="0"/>
+          <w:color w:val="111111"/>
+          <w:sz w:val="19"/>
+        </w:rPr>
+        <w:t>Re-architected a single-instance Next.js service into a cloud-native ECS Fargate deployment with DynamoDB, SQS and EventBridge to enable horizontal scaling and zero-data-loss rolling updates</w:t>
+      </w:r>
+    </w:p>
+    <w:p>
+      <w:pPr>
+        <w:spacing w:before="40" w:after="0"/>
+        <w:ind w:left="193" w:hanging="193"/>
+      </w:pPr>
+      <w:r>
+        <w:rPr>
+          <w:rFonts w:ascii="Noto Sans" w:hAnsi="Noto Sans"/>
+          <w:b w:val="0"/>
+          <w:i w:val="0"/>
+          <w:color w:val="111111"/>
+          <w:sz w:val="16"/>
+        </w:rPr>
+        <w:t xml:space="preserve">▪ </w:t>
+      </w:r>
+      <w:r>
+        <w:rPr>
+          <w:rFonts w:ascii="Noto Sans" w:hAnsi="Noto Sans"/>
+          <w:b w:val="0"/>
+          <w:i w:val="0"/>
+          <w:color w:val="111111"/>
+          <w:sz w:val="19"/>
+        </w:rPr>
+        <w:t>Evaluated Lambda + API Gateway, self-managed EC2 and App Runner against ECS Fargate on ops cost and private-subnet criteria</w:t>
+      </w:r>
+    </w:p>
+    <w:p>
+      <w:pPr>
+        <w:spacing w:after="140"/>
+      </w:pPr>
+    </w:p>
+    <w:tbl>
+      <w:tblPr>
+        <w:tblW w:type="auto" w:w="0"/>
+        <w:jc w:val="left"/>
+        <w:tblLayout w:type="autofit"/>
+        <w:tblLook w:firstColumn="1" w:firstRow="1" w:lastColumn="0" w:lastRow="0" w:noHBand="0" w:noVBand="1" w:val="04A0"/>
+        <w:tblBorders>
+          <w:top w:val="none" w:sz="0"/>
+          <w:left w:val="none" w:sz="0"/>
+          <w:bottom w:val="none" w:sz="0"/>
+          <w:right w:val="none" w:sz="0"/>
+          <w:insideH w:val="none" w:sz="0"/>
+          <w:insideV w:val="none" w:sz="0"/>
+        </w:tblBorders>
+      </w:tblPr>
+      <w:tblGrid>
+        <w:gridCol w:w="5159"/>
+        <w:gridCol w:w="5159"/>
+      </w:tblGrid>
+      <w:tr>
+        <w:tc>
+          <w:tcPr>
+            <w:tcW w:type="dxa" w:w="5159"/>
+          </w:tcPr>
+          <w:p>
+            <w:pPr>
+              <w:spacing w:before="0" w:after="0"/>
+            </w:pPr>
+            <w:r>
+              <w:rPr>
+                <w:rFonts w:ascii="Noto Sans" w:hAnsi="Noto Sans"/>
+                <w:b/>
+                <w:i w:val="0"/>
+                <w:color w:val="111111"/>
+                <w:sz w:val="21"/>
+              </w:rPr>
               <w:t>AI News Agent — Three-Scenario Routing Chatbot</w:t>
             </w:r>
           </w:p>
@@ -1110,32 +1256,6 @@
           <w:sz w:val="19"/>
         </w:rPr>
         <w:t>Designed a three-scenario classification system (LLM intent detection + Python state machine) for intelligent routing across explicit, fuzzy, and out-of-scope queries.</w:t>
-      </w:r>
-    </w:p>
-    <w:p>
-      <w:pPr>
-        <w:spacing w:before="40" w:after="0"/>
-        <w:ind w:left="193" w:hanging="193"/>
-      </w:pPr>
-      <w:r>
-        <w:rPr>
-          <w:rFonts w:ascii="Noto Sans" w:hAnsi="Noto Sans"/>
-          <w:b w:val="0"/>
-          <w:i w:val="0"/>
-          <w:color w:val="111111"/>
-          <w:sz w:val="16"/>
-        </w:rPr>
-        <w:t xml:space="preserve">▪ </w:t>
-      </w:r>
-      <w:r>
-        <w:rPr>
-          <w:rFonts w:ascii="Noto Sans" w:hAnsi="Noto Sans"/>
-          <w:b w:val="0"/>
-          <w:i w:val="0"/>
-          <w:color w:val="111111"/>
-          <w:sz w:val="19"/>
-        </w:rPr>
-        <w:t>Implemented asynchronous Lambda self-invocation to overcome LINE Webhook's 1-second timeout, supporting 5–15 second LLM inference + RAG retrieval pipelines.</w:t>
       </w:r>
     </w:p>
     <w:p>
@@ -1255,7 +1375,7 @@
           <w:color w:val="111111"/>
           <w:sz w:val="19"/>
         </w:rPr>
-        <w:t>Built an internal web app using LangGraph + PostgresSaver with a split layout (chat ↔ mode-aware workspace); BU Agent serves as the BU's single entry point (two modes) to draft v1.0 BRD, then hands off structured deliverables to the downstream BA Agent.</w:t>
+        <w:t>Built an internal web app using LangGraph + PostgresSaver with a split layout (chat ↔ mode-aware workspace)</w:t>
       </w:r>
     </w:p>
     <w:p>
@@ -1281,205 +1401,7 @@
           <w:color w:val="111111"/>
           <w:sz w:val="19"/>
         </w:rPr>
-        <w:t>Explore mode: 5-stage question bank (diverge → converge → challenge) with a live 5-dimension rubric workspace; emits a dual handoff (JSON + 200–400-word paragraph) that auto-transitions to Consult, compressing ideation to 5–10 min.</w:t>
-      </w:r>
-    </w:p>
-    <w:p>
-      <w:pPr>
-        <w:spacing w:before="40" w:after="0"/>
-        <w:ind w:left="193" w:hanging="193"/>
-      </w:pPr>
-      <w:r>
-        <w:rPr>
-          <w:rFonts w:ascii="Noto Sans" w:hAnsi="Noto Sans"/>
-          <w:b w:val="0"/>
-          <w:i w:val="0"/>
-          <w:color w:val="111111"/>
-          <w:sz w:val="16"/>
-        </w:rPr>
-        <w:t xml:space="preserve">▪ </w:t>
-      </w:r>
-      <w:r>
-        <w:rPr>
-          <w:rFonts w:ascii="Noto Sans" w:hAnsi="Noto Sans"/>
-          <w:b w:val="0"/>
-          <w:i w:val="0"/>
-          <w:color w:val="111111"/>
-          <w:sz w:val="19"/>
-        </w:rPr>
-        <w:t>Consult mode: Step 1 auto-drafts the BRD outline from per-BU YAML templates and adding status tags for each sections; Step 2 interviews only “needs_round2” tag with live-preview inline edit, keeping BU interview time to 20–30 min.</w:t>
-      </w:r>
-    </w:p>
-    <w:p>
-      <w:pPr>
-        <w:spacing w:after="140"/>
-      </w:pPr>
-    </w:p>
-    <w:tbl>
-      <w:tblPr>
-        <w:tblW w:type="auto" w:w="0"/>
-        <w:jc w:val="left"/>
-        <w:tblLayout w:type="autofit"/>
-        <w:tblLook w:firstColumn="1" w:firstRow="1" w:lastColumn="0" w:lastRow="0" w:noHBand="0" w:noVBand="1" w:val="04A0"/>
-        <w:tblBorders>
-          <w:top w:val="none" w:sz="0"/>
-          <w:left w:val="none" w:sz="0"/>
-          <w:bottom w:val="none" w:sz="0"/>
-          <w:right w:val="none" w:sz="0"/>
-          <w:insideH w:val="none" w:sz="0"/>
-          <w:insideV w:val="none" w:sz="0"/>
-        </w:tblBorders>
-      </w:tblPr>
-      <w:tblGrid>
-        <w:gridCol w:w="5159"/>
-        <w:gridCol w:w="5159"/>
-      </w:tblGrid>
-      <w:tr>
-        <w:tc>
-          <w:tcPr>
-            <w:tcW w:type="dxa" w:w="5159"/>
-          </w:tcPr>
-          <w:p>
-            <w:pPr>
-              <w:spacing w:before="0" w:after="0"/>
-            </w:pPr>
-            <w:r>
-              <w:rPr>
-                <w:rFonts w:ascii="Noto Sans" w:hAnsi="Noto Sans"/>
-                <w:b/>
-                <w:i w:val="0"/>
-                <w:color w:val="111111"/>
-                <w:sz w:val="21"/>
-              </w:rPr>
-              <w:t>Voice-Notion — Cloud-First Standup Assistant</w:t>
-            </w:r>
-          </w:p>
-        </w:tc>
-        <w:tc>
-          <w:tcPr>
-            <w:tcW w:type="dxa" w:w="5159"/>
-          </w:tcPr>
-          <w:p>
-            <w:pPr>
-              <w:spacing w:before="0" w:after="0"/>
-              <w:jc w:val="right"/>
-            </w:pPr>
-            <w:r>
-              <w:rPr>
-                <w:rFonts w:ascii="Noto Sans" w:hAnsi="Noto Sans"/>
-                <w:b w:val="0"/>
-                <w:i w:val="0"/>
-                <w:color w:val="444444"/>
-                <w:sz w:val="19"/>
-              </w:rPr>
-              <w:t>Cathay Financial Holdings, DDT AI</w:t>
-            </w:r>
-          </w:p>
-        </w:tc>
-      </w:tr>
-    </w:tbl>
-    <w:p>
-      <w:pPr>
-        <w:spacing w:before="20" w:after="0"/>
-        <w:ind w:left="193" w:hanging="193"/>
-      </w:pPr>
-      <w:r>
-        <w:rPr>
-          <w:rFonts w:ascii="Noto Sans" w:hAnsi="Noto Sans"/>
-          <w:b w:val="0"/>
-          <w:i w:val="0"/>
-          <w:color w:val="111111"/>
-          <w:sz w:val="16"/>
-        </w:rPr>
-        <w:t xml:space="preserve">▪ </w:t>
-      </w:r>
-      <w:r>
-        <w:rPr>
-          <w:rFonts w:ascii="Noto Sans" w:hAnsi="Noto Sans"/>
-          <w:b w:val="0"/>
-          <w:i w:val="0"/>
-          <w:color w:val="111111"/>
-          <w:sz w:val="19"/>
-        </w:rPr>
-        <w:t>Built a Slack bot that converts mp4 work oral report into confirmable Notion pages and tasks, plus a daily automated standup summary</w:t>
-      </w:r>
-    </w:p>
-    <w:p>
-      <w:pPr>
-        <w:spacing w:before="40" w:after="0"/>
-        <w:ind w:left="193" w:hanging="193"/>
-      </w:pPr>
-      <w:r>
-        <w:rPr>
-          <w:rFonts w:ascii="Noto Sans" w:hAnsi="Noto Sans"/>
-          <w:b w:val="0"/>
-          <w:i w:val="0"/>
-          <w:color w:val="111111"/>
-          <w:sz w:val="16"/>
-        </w:rPr>
-        <w:t xml:space="preserve">▪ </w:t>
-      </w:r>
-      <w:r>
-        <w:rPr>
-          <w:rFonts w:ascii="Noto Sans" w:hAnsi="Noto Sans"/>
-          <w:b w:val="0"/>
-          <w:i w:val="0"/>
-          <w:color w:val="111111"/>
-          <w:sz w:val="19"/>
-        </w:rPr>
-        <w:t>Re-architected a single-instance Next.js service into a cloud-native ECS Fargate deployment with DynamoDB, SQS and EventBridge to enable horizontal scaling and zero-data-loss rolling updates</w:t>
-      </w:r>
-    </w:p>
-    <w:p>
-      <w:pPr>
-        <w:spacing w:before="40" w:after="0"/>
-        <w:ind w:left="193" w:hanging="193"/>
-      </w:pPr>
-      <w:r>
-        <w:rPr>
-          <w:rFonts w:ascii="Noto Sans" w:hAnsi="Noto Sans"/>
-          <w:b w:val="0"/>
-          <w:i w:val="0"/>
-          <w:color w:val="111111"/>
-          <w:sz w:val="16"/>
-        </w:rPr>
-        <w:t xml:space="preserve">▪ </w:t>
-      </w:r>
-      <w:r>
-        <w:rPr>
-          <w:rFonts w:ascii="Noto Sans" w:hAnsi="Noto Sans"/>
-          <w:b w:val="0"/>
-          <w:i w:val="0"/>
-          <w:color w:val="111111"/>
-          <w:sz w:val="19"/>
-        </w:rPr>
-        <w:t>Split webhook handling so web verified signatures, enqueued to SQS and returned 200 within 3s while worker handled 30–120s transcription and LLM work</w:t>
-      </w:r>
-    </w:p>
-    <w:p>
-      <w:pPr>
-        <w:spacing w:before="40" w:after="0"/>
-        <w:ind w:left="193" w:hanging="193"/>
-      </w:pPr>
-      <w:r>
-        <w:rPr>
-          <w:rFonts w:ascii="Noto Sans" w:hAnsi="Noto Sans"/>
-          <w:b w:val="0"/>
-          <w:i w:val="0"/>
-          <w:color w:val="111111"/>
-          <w:sz w:val="16"/>
-        </w:rPr>
-        <w:t xml:space="preserve">▪ </w:t>
-      </w:r>
-      <w:r>
-        <w:rPr>
-          <w:rFonts w:ascii="Noto Sans" w:hAnsi="Noto Sans"/>
-          <w:b w:val="0"/>
-          <w:i w:val="0"/>
-          <w:color w:val="111111"/>
-          <w:sz w:val="19"/>
-        </w:rPr>
-        <w:t>Evaluated Lambda + API Gateway, self-managed EC2 and App Runner against ECS Fargate on persistent worker, cold start/ffmpeg, HA, ops cost and private-subnet criteria</w:t>
+        <w:t>BU Agent serves as the BU's single entry point (two modes) to draft v1.0 BRD, then hands off structured deliverables to the downstream BA Agent.</w:t>
       </w:r>
     </w:p>
     <w:p>

</xml_diff>

<commit_message>
Publish output/en/resume.docx (run 20260828T071457Z-manual)
</commit_message>
<xml_diff>
--- a/output/en/resume.docx
+++ b/output/en/resume.docx
@@ -611,189 +611,6 @@
           <w:sz w:val="19"/>
         </w:rPr>
         <w:t>Deployed a speech-driven form-filling service using streaming LLM on AWS for enterprise usage.</w:t>
-      </w:r>
-    </w:p>
-    <w:p>
-      <w:pPr>
-        <w:spacing w:after="140"/>
-      </w:pPr>
-    </w:p>
-    <w:tbl>
-      <w:tblPr>
-        <w:tblW w:type="auto" w:w="0"/>
-        <w:jc w:val="left"/>
-        <w:tblLayout w:type="autofit"/>
-        <w:tblLook w:firstColumn="1" w:firstRow="1" w:lastColumn="0" w:lastRow="0" w:noHBand="0" w:noVBand="1" w:val="04A0"/>
-        <w:tblBorders>
-          <w:top w:val="none" w:sz="0"/>
-          <w:left w:val="none" w:sz="0"/>
-          <w:bottom w:val="none" w:sz="0"/>
-          <w:right w:val="none" w:sz="0"/>
-          <w:insideH w:val="none" w:sz="0"/>
-          <w:insideV w:val="none" w:sz="0"/>
-        </w:tblBorders>
-      </w:tblPr>
-      <w:tblGrid>
-        <w:gridCol w:w="5159"/>
-        <w:gridCol w:w="5159"/>
-      </w:tblGrid>
-      <w:tr>
-        <w:tc>
-          <w:tcPr>
-            <w:tcW w:type="dxa" w:w="5159"/>
-          </w:tcPr>
-          <w:p>
-            <w:pPr>
-              <w:spacing w:before="0" w:after="0"/>
-            </w:pPr>
-            <w:r>
-              <w:rPr>
-                <w:rFonts w:ascii="Noto Sans" w:hAnsi="Noto Sans"/>
-                <w:b/>
-                <w:i w:val="0"/>
-                <w:color w:val="111111"/>
-                <w:sz w:val="21"/>
-              </w:rPr>
-              <w:t>National Taiwan University</w:t>
-            </w:r>
-          </w:p>
-        </w:tc>
-        <w:tc>
-          <w:tcPr>
-            <w:tcW w:type="dxa" w:w="5159"/>
-          </w:tcPr>
-          <w:p>
-            <w:pPr>
-              <w:spacing w:before="0" w:after="0"/>
-              <w:jc w:val="right"/>
-            </w:pPr>
-            <w:r>
-              <w:rPr>
-                <w:rFonts w:ascii="Noto Sans" w:hAnsi="Noto Sans"/>
-                <w:b w:val="0"/>
-                <w:i w:val="0"/>
-                <w:color w:val="444444"/>
-                <w:sz w:val="19"/>
-              </w:rPr>
-              <w:t>Taipei, Taiwan</w:t>
-            </w:r>
-          </w:p>
-        </w:tc>
-      </w:tr>
-    </w:tbl>
-    <w:tbl>
-      <w:tblPr>
-        <w:tblW w:type="auto" w:w="0"/>
-        <w:jc w:val="left"/>
-        <w:tblLayout w:type="autofit"/>
-        <w:tblLook w:firstColumn="1" w:firstRow="1" w:lastColumn="0" w:lastRow="0" w:noHBand="0" w:noVBand="1" w:val="04A0"/>
-        <w:tblBorders>
-          <w:top w:val="none" w:sz="0"/>
-          <w:left w:val="none" w:sz="0"/>
-          <w:bottom w:val="none" w:sz="0"/>
-          <w:right w:val="none" w:sz="0"/>
-          <w:insideH w:val="none" w:sz="0"/>
-          <w:insideV w:val="none" w:sz="0"/>
-        </w:tblBorders>
-      </w:tblPr>
-      <w:tblGrid>
-        <w:gridCol w:w="5159"/>
-        <w:gridCol w:w="5159"/>
-      </w:tblGrid>
-      <w:tr>
-        <w:tc>
-          <w:tcPr>
-            <w:tcW w:type="dxa" w:w="5159"/>
-          </w:tcPr>
-          <w:p>
-            <w:pPr>
-              <w:spacing w:before="0" w:after="0"/>
-            </w:pPr>
-            <w:r>
-              <w:rPr>
-                <w:rFonts w:ascii="Noto Sans" w:hAnsi="Noto Sans"/>
-                <w:b w:val="0"/>
-                <w:i/>
-                <w:color w:val="444444"/>
-                <w:sz w:val="19"/>
-              </w:rPr>
-              <w:t>Research Assistant — Prof. Shu-hao Shih</w:t>
-            </w:r>
-          </w:p>
-        </w:tc>
-        <w:tc>
-          <w:tcPr>
-            <w:tcW w:type="dxa" w:w="5159"/>
-          </w:tcPr>
-          <w:p>
-            <w:pPr>
-              <w:spacing w:before="0" w:after="0"/>
-              <w:jc w:val="right"/>
-            </w:pPr>
-            <w:r>
-              <w:rPr>
-                <w:rFonts w:ascii="Noto Sans" w:hAnsi="Noto Sans"/>
-                <w:b w:val="0"/>
-                <w:i w:val="0"/>
-                <w:color w:val="444444"/>
-                <w:sz w:val="19"/>
-              </w:rPr>
-              <w:t>Jun 2024 – Jun 2026</w:t>
-            </w:r>
-          </w:p>
-        </w:tc>
-      </w:tr>
-    </w:tbl>
-    <w:p>
-      <w:pPr>
-        <w:spacing w:before="20" w:after="0"/>
-        <w:ind w:left="193" w:hanging="193"/>
-      </w:pPr>
-      <w:r>
-        <w:rPr>
-          <w:rFonts w:ascii="Noto Sans" w:hAnsi="Noto Sans"/>
-          <w:b w:val="0"/>
-          <w:i w:val="0"/>
-          <w:color w:val="111111"/>
-          <w:sz w:val="16"/>
-        </w:rPr>
-        <w:t xml:space="preserve">▪ </w:t>
-      </w:r>
-      <w:r>
-        <w:rPr>
-          <w:rFonts w:ascii="Noto Sans" w:hAnsi="Noto Sans"/>
-          <w:b w:val="0"/>
-          <w:i w:val="0"/>
-          <w:color w:val="111111"/>
-          <w:sz w:val="19"/>
-        </w:rPr>
-        <w:t>Designed perception experiment schema, prepared stimuli, and analyzed data for non-moraic schwa stress-bearing naturalness.</w:t>
-      </w:r>
-    </w:p>
-    <w:p>
-      <w:pPr>
-        <w:spacing w:before="40" w:after="0"/>
-        <w:ind w:left="193" w:hanging="193"/>
-      </w:pPr>
-      <w:r>
-        <w:rPr>
-          <w:rFonts w:ascii="Noto Sans" w:hAnsi="Noto Sans"/>
-          <w:b w:val="0"/>
-          <w:i w:val="0"/>
-          <w:color w:val="111111"/>
-          <w:sz w:val="16"/>
-        </w:rPr>
-        <w:t xml:space="preserve">▪ </w:t>
-      </w:r>
-      <w:r>
-        <w:rPr>
-          <w:rFonts w:ascii="Noto Sans" w:hAnsi="Noto Sans"/>
-          <w:b w:val="0"/>
-          <w:i w:val="0"/>
-          <w:color w:val="111111"/>
-          <w:sz w:val="19"/>
-        </w:rPr>
-        <w:t>Surveyed artificial-learning-experiment related phonology papers and prepared experiment stimuli using Praat and PsychoPy.</w:t>
       </w:r>
     </w:p>
     <w:p>

</xml_diff>

<commit_message>
Publish output/en/resume.docx (run 20260828T082558Z-manual)
</commit_message>
<xml_diff>
--- a/output/en/resume.docx
+++ b/output/en/resume.docx
@@ -362,32 +362,6 @@
           <w:color w:val="111111"/>
           <w:sz w:val="19"/>
         </w:rPr>
-        <w:t>Member of NTU Chinese-English Translation Program</w:t>
-      </w:r>
-    </w:p>
-    <w:p>
-      <w:pPr>
-        <w:spacing w:before="40" w:after="0"/>
-        <w:ind w:left="193" w:hanging="193"/>
-      </w:pPr>
-      <w:r>
-        <w:rPr>
-          <w:rFonts w:ascii="Noto Sans" w:hAnsi="Noto Sans"/>
-          <w:b w:val="0"/>
-          <w:i w:val="0"/>
-          <w:color w:val="111111"/>
-          <w:sz w:val="16"/>
-        </w:rPr>
-        <w:t xml:space="preserve">▪ </w:t>
-      </w:r>
-      <w:r>
-        <w:rPr>
-          <w:rFonts w:ascii="Noto Sans" w:hAnsi="Noto Sans"/>
-          <w:b w:val="0"/>
-          <w:i w:val="0"/>
-          <w:color w:val="111111"/>
-          <w:sz w:val="19"/>
-        </w:rPr>
         <w:t>Relevant Coursework: NLP, Computational Linguistics, Phonology, Semantics</w:t>
       </w:r>
     </w:p>
@@ -508,7 +482,7 @@
                 <w:color w:val="444444"/>
                 <w:sz w:val="19"/>
               </w:rPr>
-              <w:t>ML/AI Engineer Intern</w:t>
+              <w:t>AI Engineer &amp; System Design Intern</w:t>
             </w:r>
           </w:p>
         </w:tc>
@@ -558,59 +532,9 @@
           <w:color w:val="111111"/>
           <w:sz w:val="19"/>
         </w:rPr>
-        <w:t>Optimized AI News agent orchestration logic, data ETL, LINE integration and AWS deploy architecture.</w:t>
-      </w:r>
-    </w:p>
-    <w:p>
-      <w:pPr>
-        <w:spacing w:before="40" w:after="0"/>
-        <w:ind w:left="193" w:hanging="193"/>
-      </w:pPr>
-      <w:r>
-        <w:rPr>
-          <w:rFonts w:ascii="Noto Sans" w:hAnsi="Noto Sans"/>
-          <w:b w:val="0"/>
-          <w:i w:val="0"/>
-          <w:color w:val="111111"/>
-          <w:sz w:val="16"/>
-        </w:rPr>
-        <w:t xml:space="preserve">▪ </w:t>
-      </w:r>
-      <w:r>
-        <w:rPr>
-          <w:rFonts w:ascii="Noto Sans" w:hAnsi="Noto Sans"/>
-          <w:b w:val="0"/>
-          <w:i w:val="0"/>
-          <w:color w:val="111111"/>
-          <w:sz w:val="19"/>
-        </w:rPr>
-        <w:t>Built a recording-ASR-based BRD auto-revising agent with human-in-the-loop audit.</w:t>
-      </w:r>
-    </w:p>
-    <w:p>
-      <w:pPr>
-        <w:spacing w:before="40" w:after="0"/>
-        <w:ind w:left="193" w:hanging="193"/>
-      </w:pPr>
-      <w:r>
-        <w:rPr>
-          <w:rFonts w:ascii="Noto Sans" w:hAnsi="Noto Sans"/>
-          <w:b w:val="0"/>
-          <w:i w:val="0"/>
-          <w:color w:val="111111"/>
-          <w:sz w:val="16"/>
-        </w:rPr>
-        <w:t xml:space="preserve">▪ </w:t>
-      </w:r>
-      <w:r>
-        <w:rPr>
-          <w:rFonts w:ascii="Noto Sans" w:hAnsi="Noto Sans"/>
-          <w:b w:val="0"/>
-          <w:i w:val="0"/>
-          <w:color w:val="111111"/>
-          <w:sz w:val="19"/>
-        </w:rPr>
-        <w:t>Deployed a speech-driven form-filling service using streaming LLM on AWS for enterprise usage.</w:t>
+        <w:t>Developed LLM agents for optimizing internal business use .Owning both the AI</w:t>
+        <w:br/>
+        <w:t>application layer and the cloud-oriented deployment infrastructure.</w:t>
       </w:r>
     </w:p>
     <w:p>
@@ -767,33 +691,7 @@
           <w:color w:val="111111"/>
           <w:sz w:val="19"/>
         </w:rPr>
-        <w:t>Architected a LINE LIFF App career counseling chatbot with an n8n-based RPA workflow and managed user data with Supabase.</w:t>
-      </w:r>
-    </w:p>
-    <w:p>
-      <w:pPr>
-        <w:spacing w:before="40" w:after="0"/>
-        <w:ind w:left="193" w:hanging="193"/>
-      </w:pPr>
-      <w:r>
-        <w:rPr>
-          <w:rFonts w:ascii="Noto Sans" w:hAnsi="Noto Sans"/>
-          <w:b w:val="0"/>
-          <w:i w:val="0"/>
-          <w:color w:val="111111"/>
-          <w:sz w:val="16"/>
-        </w:rPr>
-        <w:t xml:space="preserve">▪ </w:t>
-      </w:r>
-      <w:r>
-        <w:rPr>
-          <w:rFonts w:ascii="Noto Sans" w:hAnsi="Noto Sans"/>
-          <w:b w:val="0"/>
-          <w:i w:val="0"/>
-          <w:color w:val="111111"/>
-          <w:sz w:val="19"/>
-        </w:rPr>
-        <w:t>Supported Enterprise Cloud Platform education courses as technical support.</w:t>
+        <w:t>A dual delivery-and-support role: built an internal-facing application while serving as front-line technical support for enterprise course participants.</w:t>
       </w:r>
     </w:p>
     <w:p>
@@ -1460,31 +1358,6 @@
           <w:color w:val="111111"/>
           <w:sz w:val="19"/>
         </w:rPr>
-        <w:t xml:space="preserve">Cloud &amp; Infrastructure: </w:t>
-      </w:r>
-      <w:r>
-        <w:rPr>
-          <w:rFonts w:ascii="Noto Sans" w:hAnsi="Noto Sans"/>
-          <w:b w:val="0"/>
-          <w:i w:val="0"/>
-          <w:color w:val="111111"/>
-          <w:sz w:val="19"/>
-        </w:rPr>
-        <w:t>AWS (Lambda, Bedrock, OpenSearch, DynamoDB, Amazon ECR, EventBridge, Amazon SQS)</w:t>
-      </w:r>
-    </w:p>
-    <w:p>
-      <w:pPr>
-        <w:spacing w:after="40"/>
-      </w:pPr>
-      <w:r>
-        <w:rPr>
-          <w:rFonts w:ascii="Noto Sans" w:hAnsi="Noto Sans"/>
-          <w:b/>
-          <w:i w:val="0"/>
-          <w:color w:val="111111"/>
-          <w:sz w:val="19"/>
-        </w:rPr>
         <w:t xml:space="preserve">Frameworks: </w:t>
       </w:r>
       <w:r>
@@ -1520,7 +1393,7 @@
           <w:color w:val="111111"/>
           <w:sz w:val="19"/>
         </w:rPr>
-        <w:t>Microsoft Office, AWS CLI (register-task-definition, create-service, update-service, logs tail), Docker (node:20-slim image with ffmpeg, --no-cache builds)</w:t>
+        <w:t>AWS CLI, Docker</w:t>
       </w:r>
     </w:p>
     <w:p>

</xml_diff>

<commit_message>
Publish output/en/resume.docx (run 20260828T090338Z-manual)
</commit_message>
<xml_diff>
--- a/output/en/resume.docx
+++ b/output/en/resume.docx
@@ -798,7 +798,7 @@
           <w:color w:val="111111"/>
           <w:sz w:val="19"/>
         </w:rPr>
-        <w:t>Built a Slack bot that converts mp4 oral work report into confirmable Notion pages and tasks, plus a daily automated standup summary</w:t>
+        <w:t>Built a Slack bot that converts mp4 oral work report into confirmable Notion pages and tasks, plus a daily automated standup summary.</w:t>
       </w:r>
     </w:p>
     <w:p>
@@ -824,7 +824,7 @@
           <w:color w:val="111111"/>
           <w:sz w:val="19"/>
         </w:rPr>
-        <w:t>Re-architected a single-instance Next.js service into a cloud-native ECS Fargate deployment with DynamoDB, SQS and EventBridge to enable horizontal scaling and zero-data-loss rolling updates</w:t>
+        <w:t>Re-architected a single-instance Next.js service into a cloud-native ECS Fargate deployment with DynamoDB, SQS and EventBridge to enable horizontal scaling and zero-data-loss rolling updates.</w:t>
       </w:r>
     </w:p>
     <w:p>
@@ -850,7 +850,7 @@
           <w:color w:val="111111"/>
           <w:sz w:val="19"/>
         </w:rPr>
-        <w:t>Evaluated Lambda + API Gateway, self-managed EC2 and App Runner against ECS Fargate on ops cost and private-subnet criteria</w:t>
+        <w:t>Evaluated Lambda + API Gateway, self-managed EC2 and App Runner against ECS Fargate on ops cost and private-subnet criteria.</w:t>
       </w:r>
     </w:p>
     <w:p>
@@ -1090,7 +1090,7 @@
           <w:color w:val="111111"/>
           <w:sz w:val="19"/>
         </w:rPr>
-        <w:t>Built an internal web app using LangGraph + PostgresSaver with a split layout (chat ↔ mode-aware workspace)</w:t>
+        <w:t>Built an internal web app using LangGraph + PostgresSaver with a split layout (chat ↔ mode-aware workspace).</w:t>
       </w:r>
     </w:p>
     <w:p>

</xml_diff>